<commit_message>
Report: move task 5 references to the references doc
</commit_message>
<xml_diff>
--- a/Report/References.docx
+++ b/Report/References.docx
@@ -310,7 +310,8 @@
         <w:contextualSpacing w:val="0"/>
         <w:jc w:val="both"/>
         <w:rPr>
-          <w:u w:val="single"/>
+          <w:rStyle w:val="Hyperlink"/>
+          <w:color w:val="auto"/>
         </w:rPr>
       </w:pPr>
       <w:proofErr w:type="spellStart"/>
@@ -329,6 +330,166 @@
           <w:t>https://www.geeksforgeeks.org/job-sequencing-problem/</w:t>
         </w:r>
       </w:hyperlink>
+    </w:p>
+    <w:p>
+      <w:pPr>
+        <w:pStyle w:val="ListParagraph"/>
+        <w:numPr>
+          <w:ilvl w:val="0"/>
+          <w:numId w:val="4"/>
+        </w:numPr>
+        <w:spacing w:before="120" w:after="60" w:line="360" w:lineRule="auto"/>
+        <w:contextualSpacing w:val="0"/>
+        <w:jc w:val="both"/>
+        <w:rPr>
+          <w:szCs w:val="24"/>
+        </w:rPr>
+      </w:pPr>
+      <w:r>
+        <w:rPr>
+          <w:color w:val="000000"/>
+        </w:rPr>
+        <w:lastRenderedPageBreak/>
+        <w:t>Levitin, A. (2012). Introduction to the Design and Analysis of Algorithms (3rd ed.). Pearson.</w:t>
+      </w:r>
+    </w:p>
+    <w:p>
+      <w:pPr>
+        <w:pStyle w:val="ListParagraph"/>
+        <w:numPr>
+          <w:ilvl w:val="0"/>
+          <w:numId w:val="4"/>
+        </w:numPr>
+        <w:spacing w:before="120" w:after="60" w:line="360" w:lineRule="auto"/>
+        <w:contextualSpacing w:val="0"/>
+        <w:jc w:val="both"/>
+      </w:pPr>
+      <w:proofErr w:type="spellStart"/>
+      <w:r>
+        <w:rPr>
+          <w:color w:val="000000"/>
+        </w:rPr>
+        <w:t>Cormen</w:t>
+      </w:r>
+      <w:proofErr w:type="spellEnd"/>
+      <w:r>
+        <w:rPr>
+          <w:color w:val="000000"/>
+        </w:rPr>
+        <w:t xml:space="preserve">, T. H., </w:t>
+      </w:r>
+      <w:proofErr w:type="spellStart"/>
+      <w:r>
+        <w:rPr>
+          <w:color w:val="000000"/>
+        </w:rPr>
+        <w:t>Leiserson</w:t>
+      </w:r>
+      <w:proofErr w:type="spellEnd"/>
+      <w:r>
+        <w:rPr>
+          <w:color w:val="000000"/>
+        </w:rPr>
+        <w:t>, C. E., Rivest, R. L., &amp; Stein, C. (2009). Introduction to Algorithms (3rd ed.). MIT Press.</w:t>
+      </w:r>
+    </w:p>
+    <w:p>
+      <w:pPr>
+        <w:pStyle w:val="ListParagraph"/>
+        <w:numPr>
+          <w:ilvl w:val="0"/>
+          <w:numId w:val="4"/>
+        </w:numPr>
+        <w:spacing w:before="120" w:after="60" w:line="360" w:lineRule="auto"/>
+        <w:contextualSpacing w:val="0"/>
+        <w:jc w:val="both"/>
+      </w:pPr>
+      <w:proofErr w:type="spellStart"/>
+      <w:r>
+        <w:rPr>
+          <w:color w:val="000000"/>
+        </w:rPr>
+        <w:t>GeeksforGeeks</w:t>
+      </w:r>
+      <w:proofErr w:type="spellEnd"/>
+      <w:r>
+        <w:rPr>
+          <w:color w:val="000000"/>
+        </w:rPr>
+        <w:t xml:space="preserve">. (2026). Introduction to Divide and Conquer Algorithm. </w:t>
+      </w:r>
+      <w:hyperlink r:id="rId6" w:history="1">
+        <w:r>
+          <w:rPr>
+            <w:rStyle w:val="Hyperlink"/>
+          </w:rPr>
+          <w:t>https://www.geeksforgeeks.org/introduction-to-divide-and-conquer-algorithm/</w:t>
+        </w:r>
+      </w:hyperlink>
+    </w:p>
+    <w:p>
+      <w:pPr>
+        <w:pStyle w:val="ListParagraph"/>
+        <w:numPr>
+          <w:ilvl w:val="0"/>
+          <w:numId w:val="4"/>
+        </w:numPr>
+        <w:spacing w:before="120" w:after="60" w:line="360" w:lineRule="auto"/>
+        <w:contextualSpacing w:val="0"/>
+        <w:jc w:val="both"/>
+      </w:pPr>
+      <w:r>
+        <w:rPr>
+          <w:color w:val="000000"/>
+        </w:rPr>
+        <w:t xml:space="preserve">Wikipedia Contributors. (2026). Divide-and-conquer algorithm. Wikipedia. </w:t>
+      </w:r>
+      <w:hyperlink r:id="rId7" w:history="1">
+        <w:r>
+          <w:rPr>
+            <w:rStyle w:val="Hyperlink"/>
+          </w:rPr>
+          <w:t>https://en.wikipedia.org/wiki/Divide-and-conquer_algorithm</w:t>
+        </w:r>
+      </w:hyperlink>
+    </w:p>
+    <w:p>
+      <w:pPr>
+        <w:pStyle w:val="ListParagraph"/>
+        <w:numPr>
+          <w:ilvl w:val="0"/>
+          <w:numId w:val="4"/>
+        </w:numPr>
+        <w:spacing w:before="120" w:after="60" w:line="360" w:lineRule="auto"/>
+        <w:contextualSpacing w:val="0"/>
+        <w:jc w:val="both"/>
+      </w:pPr>
+      <w:r>
+        <w:rPr>
+          <w:color w:val="000000"/>
+        </w:rPr>
+        <w:t xml:space="preserve">Dasgupta, S., Papadimitriou, C., &amp; Vazirani, U. (2006). Algorithms. McGraw-Hill. </w:t>
+      </w:r>
+      <w:hyperlink r:id="rId8" w:history="1">
+        <w:r>
+          <w:rPr>
+            <w:rStyle w:val="Hyperlink"/>
+          </w:rPr>
+          <w:t>https://people.eecs.berkeley.edu/~vazirani/algorithms/chap2.pdf</w:t>
+        </w:r>
+      </w:hyperlink>
+    </w:p>
+    <w:p>
+      <w:pPr>
+        <w:pStyle w:val="ListParagraph"/>
+        <w:spacing w:before="60" w:after="60" w:line="276" w:lineRule="auto"/>
+        <w:ind w:left="360"/>
+        <w:contextualSpacing w:val="0"/>
+        <w:jc w:val="both"/>
+        <w:rPr>
+          <w:u w:val="single"/>
+        </w:rPr>
+      </w:pPr>
     </w:p>
     <w:p/>
     <w:p/>
@@ -351,6 +512,84 @@
 <file path=word/numbering.xml><?xml version="1.0" encoding="utf-8"?>
 <w:numbering xmlns:wpc="http://schemas.microsoft.com/office/word/2010/wordprocessingCanvas" xmlns:cx="http://schemas.microsoft.com/office/drawing/2014/chartex" xmlns:cx1="http://schemas.microsoft.com/office/drawing/2015/9/8/chartex" xmlns:cx2="http://schemas.microsoft.com/office/drawing/2015/10/21/chartex" xmlns:cx3="http://schemas.microsoft.com/office/drawing/2016/5/9/chartex" xmlns:cx4="http://schemas.microsoft.com/office/drawing/2016/5/10/chartex" xmlns:cx5="http://schemas.microsoft.com/office/drawing/2016/5/11/chartex" xmlns:cx6="http://schemas.microsoft.com/office/drawing/2016/5/12/chartex" xmlns:cx7="http://schemas.microsoft.com/office/drawing/2016/5/13/chartex" xmlns:cx8="http://schemas.microsoft.com/office/drawing/2016/5/14/chartex" xmlns:mc="http://schemas.openxmlformats.org/markup-compatibility/2006" xmlns:aink="http://schemas.microsoft.com/office/drawing/2016/ink" xmlns:am3d="http://schemas.microsoft.com/office/drawing/2017/model3d" xmlns:o="urn:schemas-microsoft-com:office:office" xmlns:oel="http://schemas.microsoft.com/office/2019/extlst" xmlns:r="http://schemas.openxmlformats.org/officeDocument/2006/relationships" xmlns:m="http://schemas.openxmlformats.org/officeDocument/2006/math" xmlns:v="urn:schemas-microsoft-com:vml" xmlns:wp14="http://schemas.microsoft.com/office/word/2010/wordprocessingDrawing" xmlns:wp="http://schemas.openxmlformats.org/drawingml/2006/wordprocessingDrawing" xmlns:w10="urn:schemas-microsoft-com:office:word" xmlns:w="http://schemas.openxmlformats.org/wordprocessingml/2006/main" xmlns:w14="http://schemas.microsoft.com/office/word/2010/wordml" xmlns:w15="http://schemas.microsoft.com/office/word/2012/wordml" xmlns:w16cex="http://schemas.microsoft.com/office/word/2018/wordml/cex" xmlns:w16cid="http://schemas.microsoft.com/office/word/2016/wordml/cid" xmlns:w16="http://schemas.microsoft.com/office/word/2018/wordml" xmlns:w16du="http://schemas.microsoft.com/office/word/2023/wordml/word16du" xmlns:w16sdtdh="http://schemas.microsoft.com/office/word/2020/wordml/sdtdatahash" xmlns:w16se="http://schemas.microsoft.com/office/word/2015/wordml/symex" xmlns:wpg="http://schemas.microsoft.com/office/word/2010/wordprocessingGroup" xmlns:wpi="http://schemas.microsoft.com/office/word/2010/wordprocessingInk" xmlns:wne="http://schemas.microsoft.com/office/word/2006/wordml" xmlns:wps="http://schemas.microsoft.com/office/word/2010/wordprocessingShape" mc:Ignorable="w14 w15 w16se w16cid w16 w16cex w16sdtdh wp14">
   <w:abstractNum w:abstractNumId="0" w15:restartNumberingAfterBreak="0">
+    <w:nsid w:val="17D154F0"/>
+    <w:multiLevelType w:val="hybridMultilevel"/>
+    <w:tmpl w:val="A44A4F76"/>
+    <w:lvl w:ilvl="0" w:tplc="D288377A">
+      <w:start w:val="1"/>
+      <w:numFmt w:val="decimal"/>
+      <w:lvlText w:val="%1."/>
+      <w:lvlJc w:val="left"/>
+      <w:pPr>
+        <w:ind w:left="720" w:hanging="360"/>
+      </w:pPr>
+    </w:lvl>
+    <w:lvl w:ilvl="1" w:tplc="BC022616">
+      <w:numFmt w:val="decimal"/>
+      <w:lvlText w:val=""/>
+      <w:lvlJc w:val="left"/>
+      <w:pPr>
+        <w:ind w:left="0" w:firstLine="0"/>
+      </w:pPr>
+    </w:lvl>
+    <w:lvl w:ilvl="2" w:tplc="9C2E0AAC">
+      <w:numFmt w:val="decimal"/>
+      <w:lvlText w:val=""/>
+      <w:lvlJc w:val="left"/>
+      <w:pPr>
+        <w:ind w:left="0" w:firstLine="0"/>
+      </w:pPr>
+    </w:lvl>
+    <w:lvl w:ilvl="3" w:tplc="BACE0F18">
+      <w:numFmt w:val="decimal"/>
+      <w:lvlText w:val=""/>
+      <w:lvlJc w:val="left"/>
+      <w:pPr>
+        <w:ind w:left="0" w:firstLine="0"/>
+      </w:pPr>
+    </w:lvl>
+    <w:lvl w:ilvl="4" w:tplc="663C8AB4">
+      <w:numFmt w:val="decimal"/>
+      <w:lvlText w:val=""/>
+      <w:lvlJc w:val="left"/>
+      <w:pPr>
+        <w:ind w:left="0" w:firstLine="0"/>
+      </w:pPr>
+    </w:lvl>
+    <w:lvl w:ilvl="5" w:tplc="B9E2C31C">
+      <w:numFmt w:val="decimal"/>
+      <w:lvlText w:val=""/>
+      <w:lvlJc w:val="left"/>
+      <w:pPr>
+        <w:ind w:left="0" w:firstLine="0"/>
+      </w:pPr>
+    </w:lvl>
+    <w:lvl w:ilvl="6" w:tplc="95461774">
+      <w:numFmt w:val="decimal"/>
+      <w:lvlText w:val=""/>
+      <w:lvlJc w:val="left"/>
+      <w:pPr>
+        <w:ind w:left="0" w:firstLine="0"/>
+      </w:pPr>
+    </w:lvl>
+    <w:lvl w:ilvl="7" w:tplc="FAFA1396">
+      <w:numFmt w:val="decimal"/>
+      <w:lvlText w:val=""/>
+      <w:lvlJc w:val="left"/>
+      <w:pPr>
+        <w:ind w:left="0" w:firstLine="0"/>
+      </w:pPr>
+    </w:lvl>
+    <w:lvl w:ilvl="8" w:tplc="E6DABB48">
+      <w:numFmt w:val="decimal"/>
+      <w:lvlText w:val=""/>
+      <w:lvlJc w:val="left"/>
+      <w:pPr>
+        <w:ind w:left="0" w:firstLine="0"/>
+      </w:pPr>
+    </w:lvl>
+  </w:abstractNum>
+  <w:abstractNum w:abstractNumId="1" w15:restartNumberingAfterBreak="0">
     <w:nsid w:val="306A0712"/>
     <w:multiLevelType w:val="hybridMultilevel"/>
     <w:tmpl w:val="C840DE52"/>
@@ -404,7 +643,7 @@
       <w:lvlJc w:val="left"/>
     </w:lvl>
   </w:abstractNum>
-  <w:abstractNum w:abstractNumId="1" w15:restartNumberingAfterBreak="0">
+  <w:abstractNum w:abstractNumId="2" w15:restartNumberingAfterBreak="0">
     <w:nsid w:val="55A90CF4"/>
     <w:multiLevelType w:val="hybridMultilevel"/>
     <w:tmpl w:val="52F62F94"/>
@@ -490,7 +729,7 @@
       </w:pPr>
     </w:lvl>
   </w:abstractNum>
-  <w:abstractNum w:abstractNumId="2" w15:restartNumberingAfterBreak="0">
+  <w:abstractNum w:abstractNumId="3" w15:restartNumberingAfterBreak="0">
     <w:nsid w:val="5CF31ED2"/>
     <w:multiLevelType w:val="hybridMultilevel"/>
     <w:tmpl w:val="4DEA95F4"/>
@@ -603,7 +842,7 @@
       </w:rPr>
     </w:lvl>
   </w:abstractNum>
-  <w:abstractNum w:abstractNumId="3" w15:restartNumberingAfterBreak="0">
+  <w:abstractNum w:abstractNumId="4" w15:restartNumberingAfterBreak="0">
     <w:nsid w:val="68670167"/>
     <w:multiLevelType w:val="hybridMultilevel"/>
     <w:tmpl w:val="173CADCA"/>
@@ -689,7 +928,7 @@
       </w:pPr>
     </w:lvl>
   </w:abstractNum>
-  <w:abstractNum w:abstractNumId="4" w15:restartNumberingAfterBreak="0">
+  <w:abstractNum w:abstractNumId="5" w15:restartNumberingAfterBreak="0">
     <w:nsid w:val="7CAE7C0B"/>
     <w:multiLevelType w:val="hybridMultilevel"/>
     <w:tmpl w:val="2BCA29D0"/>
@@ -803,22 +1042,36 @@
     </w:lvl>
   </w:abstractNum>
   <w:num w:numId="1" w16cid:durableId="1336766346">
+    <w:abstractNumId w:val="3"/>
+  </w:num>
+  <w:num w:numId="2" w16cid:durableId="499586978">
+    <w:abstractNumId w:val="4"/>
+  </w:num>
+  <w:num w:numId="3" w16cid:durableId="901713572">
     <w:abstractNumId w:val="2"/>
   </w:num>
-  <w:num w:numId="2" w16cid:durableId="499586978">
-    <w:abstractNumId w:val="3"/>
-  </w:num>
-  <w:num w:numId="3" w16cid:durableId="901713572">
-    <w:abstractNumId w:val="1"/>
-  </w:num>
   <w:num w:numId="4" w16cid:durableId="913706840">
-    <w:abstractNumId w:val="4"/>
+    <w:abstractNumId w:val="5"/>
   </w:num>
   <w:num w:numId="5" w16cid:durableId="489249172">
+    <w:abstractNumId w:val="1"/>
+    <w:lvlOverride w:ilvl="0">
+      <w:startOverride w:val="1"/>
+    </w:lvlOverride>
+  </w:num>
+  <w:num w:numId="6" w16cid:durableId="1088576188">
     <w:abstractNumId w:val="0"/>
     <w:lvlOverride w:ilvl="0">
       <w:startOverride w:val="1"/>
     </w:lvlOverride>
+    <w:lvlOverride w:ilvl="1"/>
+    <w:lvlOverride w:ilvl="2"/>
+    <w:lvlOverride w:ilvl="3"/>
+    <w:lvlOverride w:ilvl="4"/>
+    <w:lvlOverride w:ilvl="5"/>
+    <w:lvlOverride w:ilvl="6"/>
+    <w:lvlOverride w:ilvl="7"/>
+    <w:lvlOverride w:ilvl="8"/>
   </w:num>
 </w:numbering>
 </file>

</xml_diff>

<commit_message>
Report: revise task 10
</commit_message>
<xml_diff>
--- a/Report/References.docx
+++ b/Report/References.docx
@@ -322,7 +322,7 @@
       <w:r>
         <w:t xml:space="preserve">. (2024). Job Sequencing Problem. </w:t>
       </w:r>
-      <w:hyperlink r:id="rId5" w:history="1">
+      <w:hyperlink r:id="rId6" w:history="1">
         <w:r>
           <w:rPr>
             <w:rStyle w:val="Hyperlink"/>
@@ -418,7 +418,7 @@
         </w:rPr>
         <w:t xml:space="preserve">. (2026). Introduction to Divide and Conquer Algorithm. </w:t>
       </w:r>
-      <w:hyperlink r:id="rId6" w:history="1">
+      <w:hyperlink r:id="rId7" w:history="1">
         <w:r>
           <w:rPr>
             <w:rStyle w:val="Hyperlink"/>
@@ -444,7 +444,7 @@
         </w:rPr>
         <w:t xml:space="preserve">Wikipedia Contributors. (2026). Divide-and-conquer algorithm. Wikipedia. </w:t>
       </w:r>
-      <w:hyperlink r:id="rId7" w:history="1">
+      <w:hyperlink r:id="rId8" w:history="1">
         <w:r>
           <w:rPr>
             <w:rStyle w:val="Hyperlink"/>
@@ -463,6 +463,11 @@
         <w:spacing w:before="120" w:after="60" w:line="360" w:lineRule="auto"/>
         <w:contextualSpacing w:val="0"/>
         <w:jc w:val="both"/>
+        <w:rPr>
+          <w:rStyle w:val="Hyperlink"/>
+          <w:color w:val="auto"/>
+          <w:u w:val="none"/>
+        </w:rPr>
       </w:pPr>
       <w:r>
         <w:rPr>
@@ -470,7 +475,7 @@
         </w:rPr>
         <w:t xml:space="preserve">Dasgupta, S., Papadimitriou, C., &amp; Vazirani, U. (2006). Algorithms. McGraw-Hill. </w:t>
       </w:r>
-      <w:hyperlink r:id="rId8" w:history="1">
+      <w:hyperlink r:id="rId9" w:history="1">
         <w:r>
           <w:rPr>
             <w:rStyle w:val="Hyperlink"/>
@@ -478,6 +483,75 @@
           <w:t>https://people.eecs.berkeley.edu/~vazirani/algorithms/chap2.pdf</w:t>
         </w:r>
       </w:hyperlink>
+    </w:p>
+    <w:p>
+      <w:pPr>
+        <w:pStyle w:val="ListParagraph"/>
+        <w:numPr>
+          <w:ilvl w:val="0"/>
+          <w:numId w:val="4"/>
+        </w:numPr>
+        <w:spacing w:before="120" w:after="60" w:line="360" w:lineRule="auto"/>
+        <w:jc w:val="both"/>
+      </w:pPr>
+      <w:r>
+        <w:t xml:space="preserve">Arora, A. (2017). Analysis and Design of Algorithms. </w:t>
+      </w:r>
+    </w:p>
+    <w:p>
+      <w:pPr>
+        <w:pStyle w:val="ListParagraph"/>
+        <w:numPr>
+          <w:ilvl w:val="0"/>
+          <w:numId w:val="4"/>
+        </w:numPr>
+        <w:spacing w:before="120" w:after="60" w:line="360" w:lineRule="auto"/>
+        <w:jc w:val="both"/>
+      </w:pPr>
+      <w:r>
+        <w:t xml:space="preserve">Dynamic Programming or DP. (n.d.). Retrieved from </w:t>
+      </w:r>
+      <w:proofErr w:type="spellStart"/>
+      <w:r>
+        <w:t>geeksforgeeks</w:t>
+      </w:r>
+      <w:proofErr w:type="spellEnd"/>
+      <w:r>
+        <w:t>: https://www.geeksforgeeks.org/dsa/dynamic-programming/</w:t>
+      </w:r>
+    </w:p>
+    <w:p>
+      <w:pPr>
+        <w:pStyle w:val="ListParagraph"/>
+        <w:numPr>
+          <w:ilvl w:val="0"/>
+          <w:numId w:val="4"/>
+        </w:numPr>
+        <w:spacing w:before="120" w:after="60" w:line="360" w:lineRule="auto"/>
+        <w:jc w:val="both"/>
+      </w:pPr>
+      <w:proofErr w:type="spellStart"/>
+      <w:r>
+        <w:t>Iacono</w:t>
+      </w:r>
+      <w:proofErr w:type="spellEnd"/>
+      <w:r>
+        <w:t>, A. (2017, oct 7). Backtracking explained. Retrieved from medium: https://medium.com/@andreaiacono/backtracking-explained-7450d6ef9e1a</w:t>
+      </w:r>
+    </w:p>
+    <w:p>
+      <w:pPr>
+        <w:pStyle w:val="ListParagraph"/>
+        <w:numPr>
+          <w:ilvl w:val="0"/>
+          <w:numId w:val="4"/>
+        </w:numPr>
+        <w:spacing w:before="120" w:after="60" w:line="360" w:lineRule="auto"/>
+        <w:jc w:val="both"/>
+      </w:pPr>
+      <w:r>
+        <w:t xml:space="preserve">Levitin, A. (2012). Introduction to the Design and Analysis of Algorithms. </w:t>
+      </w:r>
     </w:p>
     <w:p>
       <w:pPr>
@@ -1934,4 +2008,84 @@
     </a:ext>
   </a:extLst>
 </a:theme>
+</file>
+
+<file path=customXml/item1.xml><?xml version="1.0" encoding="utf-8"?>
+<b:Sources xmlns:b="http://schemas.openxmlformats.org/officeDocument/2006/bibliography" xmlns="http://schemas.openxmlformats.org/officeDocument/2006/bibliography" SelectedStyle="\APASixthEditionOfficeOnline.xsl" StyleName="APA" Version="6">
+  <b:Source>
+    <b:Tag>And17</b:Tag>
+    <b:SourceType>InternetSite</b:SourceType>
+    <b:Guid>{4791A06C-8BAA-491A-AD22-248E8C8EB129}</b:Guid>
+    <b:Author>
+      <b:Author>
+        <b:NameList>
+          <b:Person>
+            <b:Last>Iacono</b:Last>
+            <b:First>Andrea</b:First>
+          </b:Person>
+        </b:NameList>
+      </b:Author>
+    </b:Author>
+    <b:Title>Backtracking explained</b:Title>
+    <b:InternetSiteTitle>medium</b:InternetSiteTitle>
+    <b:Year>2017</b:Year>
+    <b:Month>oct</b:Month>
+    <b:Day>7</b:Day>
+    <b:URL>https://medium.com/@andreaiacono/backtracking-explained-7450d6ef9e1a</b:URL>
+    <b:RefOrder>1</b:RefOrder>
+  </b:Source>
+  <b:Source>
+    <b:Tag>Dyn</b:Tag>
+    <b:SourceType>InternetSite</b:SourceType>
+    <b:Guid>{42604672-9DBD-4125-8448-C5BC3B60D029}</b:Guid>
+    <b:Title>Dynamic Programming or DP</b:Title>
+    <b:InternetSiteTitle>geeksforgeeks</b:InternetSiteTitle>
+    <b:URL>https://www.geeksforgeeks.org/dsa/dynamic-programming/</b:URL>
+    <b:RefOrder>2</b:RefOrder>
+  </b:Source>
+  <b:Source>
+    <b:Tag>Lev12</b:Tag>
+    <b:SourceType>Book</b:SourceType>
+    <b:Guid>{F604D6AC-1AC0-4C3E-ACD6-D4E52D78B05B}</b:Guid>
+    <b:Title>Introduction to the Design and Analysis of Algorithms</b:Title>
+    <b:Year>2012</b:Year>
+    <b:Author>
+      <b:Author>
+        <b:NameList>
+          <b:Person>
+            <b:Last>Levitin</b:Last>
+            <b:First>Anany</b:First>
+          </b:Person>
+        </b:NameList>
+      </b:Author>
+    </b:Author>
+    <b:RefOrder>3</b:RefOrder>
+  </b:Source>
+  <b:Source>
+    <b:Tag>Aro17</b:Tag>
+    <b:SourceType>Book</b:SourceType>
+    <b:Guid>{DCBFA00D-DA2C-4828-AB3B-C925E08ACDF5}</b:Guid>
+    <b:Author>
+      <b:Author>
+        <b:NameList>
+          <b:Person>
+            <b:Last>Arora</b:Last>
+            <b:First>Amrinder</b:First>
+          </b:Person>
+        </b:NameList>
+      </b:Author>
+    </b:Author>
+    <b:Title>Analysis and Design of Algorithms</b:Title>
+    <b:Year>2017</b:Year>
+    <b:RefOrder>4</b:RefOrder>
+  </b:Source>
+</b:Sources>
+</file>
+
+<file path=customXml/itemProps1.xml><?xml version="1.0" encoding="utf-8"?>
+<ds:datastoreItem xmlns:ds="http://schemas.openxmlformats.org/officeDocument/2006/customXml" ds:itemID="{7357D27E-C813-4BFB-A9A7-AEAD0E614C53}">
+  <ds:schemaRefs>
+    <ds:schemaRef ds:uri="http://schemas.openxmlformats.org/officeDocument/2006/bibliography"/>
+  </ds:schemaRefs>
+</ds:datastoreItem>
 </file>
</xml_diff>

<commit_message>
Report: Revise task 1
</commit_message>
<xml_diff>
--- a/Report/References.docx
+++ b/Report/References.docx
@@ -536,8 +536,13 @@
       </w:r>
       <w:proofErr w:type="spellEnd"/>
       <w:r>
-        <w:t>, A. (2017, oct 7). Backtracking explained. Retrieved from medium: https://medium.com/@andreaiacono/backtracking-explained-7450d6ef9e1a</w:t>
-      </w:r>
+        <w:t xml:space="preserve">, A. (2017, oct 7). Backtracking explained. Retrieved from medium: </w:t>
+      </w:r>
+      <w:proofErr w:type="gramStart"/>
+      <w:r>
+        <w:t>https://medium.com/@andreaiacono/backtracking-explained-7450d6ef9e1a</w:t>
+      </w:r>
+      <w:proofErr w:type="gramEnd"/>
     </w:p>
     <w:p>
       <w:pPr>
@@ -552,6 +557,222 @@
       <w:r>
         <w:t xml:space="preserve">Levitin, A. (2012). Introduction to the Design and Analysis of Algorithms. </w:t>
       </w:r>
+    </w:p>
+    <w:p>
+      <w:pPr>
+        <w:pStyle w:val="ListParagraph"/>
+        <w:numPr>
+          <w:ilvl w:val="0"/>
+          <w:numId w:val="4"/>
+        </w:numPr>
+        <w:rPr>
+          <w:rFonts w:cstheme="minorBidi"/>
+          <w:szCs w:val="24"/>
+        </w:rPr>
+      </w:pPr>
+      <w:proofErr w:type="spellStart"/>
+      <w:r>
+        <w:rPr>
+          <w:b/>
+          <w:bCs/>
+        </w:rPr>
+        <w:t>Golomb</w:t>
+      </w:r>
+      <w:proofErr w:type="spellEnd"/>
+      <w:r>
+        <w:rPr>
+          <w:b/>
+          <w:bCs/>
+        </w:rPr>
+        <w:t>, S. W. (1954). "Checker boards and polyominoes".</w:t>
+      </w:r>
+      <w:r>
+        <w:t xml:space="preserve"> </w:t>
+      </w:r>
+      <w:r>
+        <w:rPr>
+          <w:i/>
+          <w:iCs/>
+        </w:rPr>
+        <w:t>American Mathematical Monthly</w:t>
+      </w:r>
+      <w:r>
+        <w:t xml:space="preserve">, 61(10), 675–682. </w:t>
+      </w:r>
+      <w:r>
+        <w:rPr>
+          <w:i/>
+          <w:iCs/>
+        </w:rPr>
+        <w:t>(Note: This is the original paper that mathematically proved the 2</w:t>
+      </w:r>
+      <w:r>
+        <w:rPr>
+          <w:i/>
+          <w:iCs/>
+          <w:vertAlign w:val="superscript"/>
+        </w:rPr>
+        <w:t>n</w:t>
+      </w:r>
+      <w:r>
+        <w:rPr>
+          <w:i/>
+          <w:iCs/>
+        </w:rPr>
+        <w:t xml:space="preserve"> times 2</w:t>
+      </w:r>
+      <w:r>
+        <w:rPr>
+          <w:i/>
+          <w:iCs/>
+          <w:vertAlign w:val="superscript"/>
+        </w:rPr>
+        <w:t>n</w:t>
+      </w:r>
+      <w:r>
+        <w:rPr>
+          <w:i/>
+          <w:iCs/>
+        </w:rPr>
+        <w:t xml:space="preserve"> board can be tiled using divide and conquer algorithm).</w:t>
+      </w:r>
+      <w:r>
+        <w:t xml:space="preserve"> </w:t>
+      </w:r>
+    </w:p>
+    <w:p>
+      <w:pPr>
+        <w:pStyle w:val="ListParagraph"/>
+        <w:numPr>
+          <w:ilvl w:val="0"/>
+          <w:numId w:val="4"/>
+        </w:numPr>
+      </w:pPr>
+      <w:proofErr w:type="spellStart"/>
+      <w:r>
+        <w:rPr>
+          <w:b/>
+          <w:bCs/>
+        </w:rPr>
+        <w:t>Golomb</w:t>
+      </w:r>
+      <w:proofErr w:type="spellEnd"/>
+      <w:r>
+        <w:rPr>
+          <w:b/>
+          <w:bCs/>
+        </w:rPr>
+        <w:t xml:space="preserve">, S. W. (1994). </w:t>
+      </w:r>
+      <w:r>
+        <w:rPr>
+          <w:b/>
+          <w:bCs/>
+          <w:i/>
+          <w:iCs/>
+        </w:rPr>
+        <w:t>Polyominoes: Puzzles, Patterns, Problems, and Packings</w:t>
+      </w:r>
+      <w:r>
+        <w:rPr>
+          <w:b/>
+          <w:bCs/>
+        </w:rPr>
+        <w:t xml:space="preserve"> (2nd ed.).</w:t>
+      </w:r>
+      <w:r>
+        <w:t xml:space="preserve"> Princeton, New Jersey: Princeton University Press. </w:t>
+      </w:r>
+    </w:p>
+    <w:p>
+      <w:pPr>
+        <w:pStyle w:val="ListParagraph"/>
+        <w:numPr>
+          <w:ilvl w:val="0"/>
+          <w:numId w:val="4"/>
+        </w:numPr>
+      </w:pPr>
+      <w:r>
+        <w:rPr>
+          <w:b/>
+          <w:bCs/>
+        </w:rPr>
+        <w:t>Wikipedia contributors. (n.d.). "</w:t>
+      </w:r>
+      <w:proofErr w:type="spellStart"/>
+      <w:r>
+        <w:rPr>
+          <w:b/>
+          <w:bCs/>
+        </w:rPr>
+        <w:t>Tromino</w:t>
+      </w:r>
+      <w:proofErr w:type="spellEnd"/>
+      <w:r>
+        <w:rPr>
+          <w:b/>
+          <w:bCs/>
+        </w:rPr>
+        <w:t>".</w:t>
+      </w:r>
+      <w:r>
+        <w:t xml:space="preserve"> </w:t>
+      </w:r>
+      <w:r>
+        <w:rPr>
+          <w:i/>
+          <w:iCs/>
+        </w:rPr>
+        <w:t>Wikipedia, The Free Encyclopedia</w:t>
+      </w:r>
+      <w:r>
+        <w:t xml:space="preserve">. Retrieved from </w:t>
+      </w:r>
+      <w:hyperlink r:id="rId10" w:tgtFrame="_blank" w:history="1">
+        <w:r>
+          <w:rPr>
+            <w:rStyle w:val="Hyperlink"/>
+          </w:rPr>
+          <w:t>https://en.wikipedia.org/wiki/Tromino</w:t>
+        </w:r>
+      </w:hyperlink>
+      <w:r>
+        <w:t xml:space="preserve"> </w:t>
+      </w:r>
+      <w:r>
+        <w:rPr>
+          <w:i/>
+          <w:iCs/>
+        </w:rPr>
+        <w:t xml:space="preserve">(Note: Good general reference for </w:t>
+      </w:r>
+      <w:proofErr w:type="spellStart"/>
+      <w:r>
+        <w:rPr>
+          <w:i/>
+          <w:iCs/>
+        </w:rPr>
+        <w:t>Golomb's</w:t>
+      </w:r>
+      <w:proofErr w:type="spellEnd"/>
+      <w:r>
+        <w:rPr>
+          <w:i/>
+          <w:iCs/>
+        </w:rPr>
+        <w:t xml:space="preserve"> theorem and rep-tiling).</w:t>
+      </w:r>
+    </w:p>
+    <w:p>
+      <w:pPr>
+        <w:pStyle w:val="ListParagraph"/>
+        <w:numPr>
+          <w:ilvl w:val="0"/>
+          <w:numId w:val="4"/>
+        </w:numPr>
+        <w:spacing w:before="120" w:after="60" w:line="360" w:lineRule="auto"/>
+        <w:jc w:val="both"/>
+      </w:pPr>
     </w:p>
     <w:p>
       <w:pPr>
@@ -1005,7 +1226,7 @@
   <w:abstractNum w:abstractNumId="5" w15:restartNumberingAfterBreak="0">
     <w:nsid w:val="7CAE7C0B"/>
     <w:multiLevelType w:val="hybridMultilevel"/>
-    <w:tmpl w:val="2BCA29D0"/>
+    <w:tmpl w:val="75862B0C"/>
     <w:lvl w:ilvl="0" w:tplc="04090001">
       <w:start w:val="1"/>
       <w:numFmt w:val="bullet"/>

</xml_diff>

<commit_message>
Add task 8's references
</commit_message>
<xml_diff>
--- a/Report/References.docx
+++ b/Report/References.docx
@@ -11,6 +11,114 @@
       </w:r>
     </w:p>
     <w:p>
+      <w:r>
+        <w:t xml:space="preserve">[1] </w:t>
+      </w:r>
+      <w:proofErr w:type="spellStart"/>
+      <w:r>
+        <w:t>Anany</w:t>
+      </w:r>
+      <w:proofErr w:type="spellEnd"/>
+      <w:r>
+        <w:t xml:space="preserve"> Levitin, Introduction to the Design and Analysis of Algorithms, 3rd ed., Pearson.</w:t>
+      </w:r>
+    </w:p>
+    <w:p>
+      <w:r>
+        <w:t xml:space="preserve">[2] </w:t>
+      </w:r>
+      <w:proofErr w:type="spellStart"/>
+      <w:r>
+        <w:t>Amrinder</w:t>
+      </w:r>
+      <w:proofErr w:type="spellEnd"/>
+      <w:r>
+        <w:t xml:space="preserve"> Arora, Analysis and Design of Algorithms, 2nd ed.</w:t>
+      </w:r>
+    </w:p>
+    <w:p>
+      <w:r>
+        <w:t xml:space="preserve">[3] T. H. </w:t>
+      </w:r>
+      <w:proofErr w:type="spellStart"/>
+      <w:r>
+        <w:t>Cormen</w:t>
+      </w:r>
+      <w:proofErr w:type="spellEnd"/>
+      <w:r>
+        <w:t xml:space="preserve">, C. E. </w:t>
+      </w:r>
+      <w:proofErr w:type="spellStart"/>
+      <w:r>
+        <w:t>Leiserson</w:t>
+      </w:r>
+      <w:proofErr w:type="spellEnd"/>
+      <w:r>
+        <w:t>, R. L. Rivest, and C. Stein, Introduction to Algorithms, 4th ed., MIT Press.</w:t>
+      </w:r>
+    </w:p>
+    <w:p>
+      <w:r>
+        <w:t xml:space="preserve">[4] M. </w:t>
+      </w:r>
+      <w:proofErr w:type="spellStart"/>
+      <w:r>
+        <w:t>Stoer</w:t>
+      </w:r>
+      <w:proofErr w:type="spellEnd"/>
+      <w:r>
+        <w:t xml:space="preserve"> and F. Wagner, “A Simple Min-Cut Algorithm,” Journal of the ACM, 44(4), 1997.</w:t>
+      </w:r>
+    </w:p>
+    <w:p>
+      <w:r>
+        <w:t xml:space="preserve">[5] R. K. Ahuja, T. L. </w:t>
+      </w:r>
+      <w:proofErr w:type="spellStart"/>
+      <w:r>
+        <w:t>Magnanti</w:t>
+      </w:r>
+      <w:proofErr w:type="spellEnd"/>
+      <w:r>
+        <w:t>, and J. B. Orlin, Network Flows: Theory, Algorithms, and Applications, 1993.</w:t>
+      </w:r>
+    </w:p>
+    <w:p>
+      <w:r>
+        <w:t xml:space="preserve">[6] E. </w:t>
+      </w:r>
+      <w:proofErr w:type="spellStart"/>
+      <w:r>
+        <w:t>Aarts</w:t>
+      </w:r>
+      <w:proofErr w:type="spellEnd"/>
+      <w:r>
+        <w:t xml:space="preserve"> and J. K. </w:t>
+      </w:r>
+      <w:proofErr w:type="spellStart"/>
+      <w:r>
+        <w:t>Lenstra</w:t>
+      </w:r>
+      <w:proofErr w:type="spellEnd"/>
+      <w:r>
+        <w:t xml:space="preserve"> (eds.), Local Search in Combinatorial Optimization, Princeton University Press, 2003.</w:t>
+      </w:r>
+    </w:p>
+    <w:p>
+      <w:r>
+        <w:t xml:space="preserve">[7] E.-G. </w:t>
+      </w:r>
+      <w:proofErr w:type="spellStart"/>
+      <w:r>
+        <w:t>Talbi</w:t>
+      </w:r>
+      <w:proofErr w:type="spellEnd"/>
+      <w:r>
+        <w:t>, Metaheuristics: From Design to Implementation, Wiley, 2009.</w:t>
+      </w:r>
+    </w:p>
+    <w:p/>
+    <w:p>
       <w:pPr>
         <w:pStyle w:val="ListParagraph"/>
         <w:numPr>
@@ -216,6 +324,7 @@
         <w:rPr>
           <w:color w:val="000000"/>
         </w:rPr>
+        <w:lastRenderedPageBreak/>
         <w:t>[6] Russell, S., &amp; Norvig, P. (2020). Artificial Intelligence: A Modern Approach (4th ed.). Pearson. Chapter 3 covers BFS, A*, IDA*, and heuristic design.</w:t>
       </w:r>
     </w:p>
@@ -349,7 +458,6 @@
         <w:rPr>
           <w:color w:val="000000"/>
         </w:rPr>
-        <w:lastRenderedPageBreak/>
         <w:t>Levitin, A. (2012). Introduction to the Design and Analysis of Algorithms (3rd ed.). Pearson.</w:t>
       </w:r>
     </w:p>
@@ -536,13 +644,8 @@
       </w:r>
       <w:proofErr w:type="spellEnd"/>
       <w:r>
-        <w:t xml:space="preserve">, A. (2017, oct 7). Backtracking explained. Retrieved from medium: </w:t>
-      </w:r>
-      <w:proofErr w:type="gramStart"/>
-      <w:r>
-        <w:t>https://medium.com/@andreaiacono/backtracking-explained-7450d6ef9e1a</w:t>
-      </w:r>
-      <w:proofErr w:type="gramEnd"/>
+        <w:t>, A. (2017, oct 7). Backtracking explained. Retrieved from medium: https://medium.com/@andreaiacono/backtracking-explained-7450d6ef9e1a</w:t>
+      </w:r>
     </w:p>
     <w:p>
       <w:pPr>
@@ -604,7 +707,15 @@
           <w:i/>
           <w:iCs/>
         </w:rPr>
-        <w:t>(Note: This is the original paper that mathematically proved the 2</w:t>
+        <w:t xml:space="preserve">(Note: This is the original paper that </w:t>
+      </w:r>
+      <w:r>
+        <w:rPr>
+          <w:i/>
+          <w:iCs/>
+        </w:rPr>
+        <w:lastRenderedPageBreak/>
+        <w:t>mathematically proved the 2</w:t>
       </w:r>
       <w:r>
         <w:rPr>

</xml_diff>

<commit_message>
Report: format tasks 4 & 6 reports
</commit_message>
<xml_diff>
--- a/Report/References.docx
+++ b/Report/References.docx
@@ -897,7 +897,141 @@
         </w:rPr>
       </w:pPr>
     </w:p>
-    <w:p/>
+    <w:p>
+      <w:r>
+        <w:t xml:space="preserve">[1]  T. H. </w:t>
+      </w:r>
+      <w:proofErr w:type="spellStart"/>
+      <w:r>
+        <w:t>Cormen</w:t>
+      </w:r>
+      <w:proofErr w:type="spellEnd"/>
+      <w:r>
+        <w:t xml:space="preserve">, C. E. </w:t>
+      </w:r>
+      <w:proofErr w:type="spellStart"/>
+      <w:r>
+        <w:t>Leiserson</w:t>
+      </w:r>
+      <w:proofErr w:type="spellEnd"/>
+      <w:r>
+        <w:t>, R. L. Rivest, and C. Stein, Introduction to Algorithms, 4th ed. Cambridge, MA: MIT Press, 2022.</w:t>
+      </w:r>
+    </w:p>
+    <w:p>
+      <w:r>
+        <w:t xml:space="preserve">[2]  S. S. </w:t>
+      </w:r>
+      <w:proofErr w:type="spellStart"/>
+      <w:r>
+        <w:t>Skiena</w:t>
+      </w:r>
+      <w:proofErr w:type="spellEnd"/>
+      <w:r>
+        <w:t>, The Algorithm Design Manual, 2nd ed. New York: Springer, 2008.</w:t>
+      </w:r>
+    </w:p>
+    <w:p>
+      <w:r>
+        <w:t xml:space="preserve">[3]  M. Gardner, Aha! Insight. New York: W. H. Freeman, 1978. [Original source of the 9-dots puzzle and its </w:t>
+      </w:r>
+      <w:proofErr w:type="spellStart"/>
+      <w:r>
+        <w:t>generalisations</w:t>
+      </w:r>
+      <w:proofErr w:type="spellEnd"/>
+      <w:r>
+        <w:t>.]</w:t>
+      </w:r>
+    </w:p>
+    <w:p>
+      <w:r>
+        <w:t>[4]  D. E. Knuth, The Art of Computer Programming, Vol. 1: Fundamental Algorithms, 3rd ed. Boston: Addison-Wesley, 1997.</w:t>
+      </w:r>
+    </w:p>
+    <w:p>
+      <w:r>
+        <w:t>[5]  S. Russell and P. Norvig, Artificial Intelligence: A Modern Approach, 4th ed. Hoboken, NJ: Pearson, 2020. [Chapter 3: Solving Problems by Searching.]</w:t>
+      </w:r>
+    </w:p>
+    <w:p>
+      <w:r>
+        <w:t>[6]  R. E. Bellman, Dynamic Programming. Princeton, NJ: Princeton University Press, 1957. [Foundational DP reference.]</w:t>
+      </w:r>
+    </w:p>
+    <w:p>
+      <w:r>
+        <w:t xml:space="preserve">[7]  F. P. </w:t>
+      </w:r>
+      <w:proofErr w:type="spellStart"/>
+      <w:r>
+        <w:t>Preparata</w:t>
+      </w:r>
+      <w:proofErr w:type="spellEnd"/>
+      <w:r>
+        <w:t xml:space="preserve"> and M. I. </w:t>
+      </w:r>
+      <w:proofErr w:type="spellStart"/>
+      <w:r>
+        <w:t>Shamos</w:t>
+      </w:r>
+      <w:proofErr w:type="spellEnd"/>
+      <w:r>
+        <w:t>, Computational Geometry: An Introduction. New York: Springer, 1985. [Geometric algorithms and point-on-segment tests.]</w:t>
+      </w:r>
+    </w:p>
+    <w:p>
+      <w:r>
+        <w:t xml:space="preserve">[8]  M. de Berg, O. Cheong, M. van </w:t>
+      </w:r>
+      <w:proofErr w:type="spellStart"/>
+      <w:r>
+        <w:t>Kreveld</w:t>
+      </w:r>
+      <w:proofErr w:type="spellEnd"/>
+      <w:r>
+        <w:t>, and M. Overmars, Computational Geometry: Algorithms and Applications, 3rd ed. Berlin: Springer, 2008.</w:t>
+      </w:r>
+    </w:p>
+    <w:p>
+      <w:r>
+        <w:t>[9]  R. Sedgewick and K. Wayne, Algorithms, 4th ed. Boston: Addison-Wesley, 2011. [Graph search algorithms and backtracking.]</w:t>
+      </w:r>
+    </w:p>
+    <w:p>
+      <w:r>
+        <w:t xml:space="preserve">[10] B. </w:t>
+      </w:r>
+      <w:proofErr w:type="spellStart"/>
+      <w:r>
+        <w:t>Stroustrup</w:t>
+      </w:r>
+      <w:proofErr w:type="spellEnd"/>
+      <w:r>
+        <w:t>, The C++ Programming Language, 4th ed. Boston: Addison-Wesley, 2013. [C++17 implementation reference.]</w:t>
+      </w:r>
+    </w:p>
+    <w:p>
+      <w:r>
+        <w:t xml:space="preserve">[11] D. Applegate, R. Bixby, V. </w:t>
+      </w:r>
+      <w:proofErr w:type="spellStart"/>
+      <w:r>
+        <w:t>Chvátal</w:t>
+      </w:r>
+      <w:proofErr w:type="spellEnd"/>
+      <w:r>
+        <w:t xml:space="preserve">, and W. Cook, The Traveling Salesman Problem: A Computational Study. Princeton, NJ: Princeton University Press, 2006. [Combinatorial </w:t>
+      </w:r>
+      <w:proofErr w:type="spellStart"/>
+      <w:r>
+        <w:t>optimisation</w:t>
+      </w:r>
+      <w:proofErr w:type="spellEnd"/>
+      <w:r>
+        <w:t xml:space="preserve"> background.]</w:t>
+      </w:r>
+    </w:p>
     <w:p/>
     <w:p/>
     <w:p/>

</xml_diff>

<commit_message>
Report: Add references section
</commit_message>
<xml_diff>
--- a/Report/References.docx
+++ b/Report/References.docx
@@ -7,46 +7,216 @@
         <w:pStyle w:val="Heading1"/>
       </w:pPr>
       <w:r>
-        <w:t>References</w:t>
-      </w:r>
-    </w:p>
-    <w:p>
-      <w:r>
-        <w:t xml:space="preserve">[1] </w:t>
-      </w:r>
+        <w:t>11. References</w:t>
+      </w:r>
+    </w:p>
+    <w:p>
+      <w:pPr>
+        <w:pStyle w:val="ListParagraph"/>
+        <w:numPr>
+          <w:ilvl w:val="0"/>
+          <w:numId w:val="9"/>
+        </w:numPr>
+      </w:pPr>
       <w:proofErr w:type="spellStart"/>
       <w:r>
-        <w:t>Anany</w:t>
+        <w:t>Aarts</w:t>
       </w:r>
       <w:proofErr w:type="spellEnd"/>
       <w:r>
-        <w:t xml:space="preserve"> Levitin, Introduction to the Design and Analysis of Algorithms, 3rd ed., Pearson.</w:t>
-      </w:r>
-    </w:p>
-    <w:p>
-      <w:r>
-        <w:t xml:space="preserve">[2] </w:t>
+        <w:t xml:space="preserve">, E., &amp; </w:t>
       </w:r>
       <w:proofErr w:type="spellStart"/>
       <w:r>
-        <w:t>Amrinder</w:t>
+        <w:t>Lenstra</w:t>
       </w:r>
       <w:proofErr w:type="spellEnd"/>
       <w:r>
-        <w:t xml:space="preserve"> Arora, Analysis and Design of Algorithms, 2nd ed.</w:t>
-      </w:r>
-    </w:p>
-    <w:p>
-      <w:r>
-        <w:t xml:space="preserve">[3] T. H. </w:t>
+        <w:t xml:space="preserve">, J. K. (Eds.). (2003). </w:t>
+      </w:r>
+      <w:r>
+        <w:rPr>
+          <w:i/>
+          <w:iCs/>
+        </w:rPr>
+        <w:t>Local search in combinatorial optimization</w:t>
+      </w:r>
+      <w:r>
+        <w:t>. Princeton University Press.</w:t>
+      </w:r>
+    </w:p>
+    <w:p>
+      <w:pPr>
+        <w:pStyle w:val="ListParagraph"/>
+        <w:numPr>
+          <w:ilvl w:val="0"/>
+          <w:numId w:val="9"/>
+        </w:numPr>
+      </w:pPr>
+      <w:r>
+        <w:t xml:space="preserve">Ahuja, R. K., </w:t>
       </w:r>
       <w:proofErr w:type="spellStart"/>
       <w:r>
+        <w:t>Magnanti</w:t>
+      </w:r>
+      <w:proofErr w:type="spellEnd"/>
+      <w:r>
+        <w:t xml:space="preserve">, T. L., &amp; Orlin, J. B. (1993). </w:t>
+      </w:r>
+      <w:r>
+        <w:rPr>
+          <w:i/>
+          <w:iCs/>
+        </w:rPr>
+        <w:t>Network flows: Theory, algorithms, and applications</w:t>
+      </w:r>
+      <w:r>
+        <w:t>. Prentice Hall.</w:t>
+      </w:r>
+    </w:p>
+    <w:p>
+      <w:pPr>
+        <w:pStyle w:val="ListParagraph"/>
+        <w:numPr>
+          <w:ilvl w:val="0"/>
+          <w:numId w:val="9"/>
+        </w:numPr>
+      </w:pPr>
+      <w:r>
+        <w:t xml:space="preserve">Applegate, D., Bixby, R., </w:t>
+      </w:r>
+      <w:proofErr w:type="spellStart"/>
+      <w:r>
+        <w:t>Chvátal</w:t>
+      </w:r>
+      <w:proofErr w:type="spellEnd"/>
+      <w:r>
+        <w:t xml:space="preserve">, V., &amp; Cook, W. (2006). </w:t>
+      </w:r>
+      <w:r>
+        <w:rPr>
+          <w:i/>
+          <w:iCs/>
+        </w:rPr>
+        <w:t>The traveling salesman problem: A computational study</w:t>
+      </w:r>
+      <w:r>
+        <w:t>. Princeton University Press.</w:t>
+      </w:r>
+    </w:p>
+    <w:p>
+      <w:pPr>
+        <w:pStyle w:val="ListParagraph"/>
+        <w:numPr>
+          <w:ilvl w:val="0"/>
+          <w:numId w:val="9"/>
+        </w:numPr>
+      </w:pPr>
+      <w:r>
+        <w:t xml:space="preserve">Arora, A. (2017). </w:t>
+      </w:r>
+      <w:r>
+        <w:rPr>
+          <w:i/>
+          <w:iCs/>
+        </w:rPr>
+        <w:t>Analysis and design of algorithms</w:t>
+      </w:r>
+      <w:r>
+        <w:t xml:space="preserve"> (2nd ed.). </w:t>
+      </w:r>
+      <w:proofErr w:type="spellStart"/>
+      <w:r>
+        <w:t>Cognella</w:t>
+      </w:r>
+      <w:proofErr w:type="spellEnd"/>
+      <w:r>
+        <w:t xml:space="preserve"> Academic Publishing.</w:t>
+      </w:r>
+    </w:p>
+    <w:p>
+      <w:pPr>
+        <w:pStyle w:val="ListParagraph"/>
+        <w:numPr>
+          <w:ilvl w:val="0"/>
+          <w:numId w:val="9"/>
+        </w:numPr>
+      </w:pPr>
+      <w:r>
+        <w:t xml:space="preserve">Bellman, R. E. (1957). </w:t>
+      </w:r>
+      <w:r>
+        <w:rPr>
+          <w:i/>
+          <w:iCs/>
+        </w:rPr>
+        <w:t>Dynamic programming</w:t>
+      </w:r>
+      <w:r>
+        <w:t>. Princeton University Press.</w:t>
+      </w:r>
+    </w:p>
+    <w:p>
+      <w:pPr>
+        <w:pStyle w:val="ListParagraph"/>
+        <w:numPr>
+          <w:ilvl w:val="0"/>
+          <w:numId w:val="9"/>
+        </w:numPr>
+      </w:pPr>
+      <w:proofErr w:type="spellStart"/>
+      <w:r>
+        <w:t>Bousch</w:t>
+      </w:r>
+      <w:proofErr w:type="spellEnd"/>
+      <w:r>
+        <w:t xml:space="preserve">, T. (2014). La </w:t>
+      </w:r>
+      <w:proofErr w:type="spellStart"/>
+      <w:r>
+        <w:t>quatrieme</w:t>
+      </w:r>
+      <w:proofErr w:type="spellEnd"/>
+      <w:r>
+        <w:t xml:space="preserve"> tour de Hanoi. </w:t>
+      </w:r>
+      <w:r>
+        <w:rPr>
+          <w:i/>
+          <w:iCs/>
+        </w:rPr>
+        <w:t>Bulletin of the Belgian Mathematical Society</w:t>
+      </w:r>
+      <w:r>
+        <w:t xml:space="preserve">, </w:t>
+      </w:r>
+      <w:r>
+        <w:rPr>
+          <w:i/>
+          <w:iCs/>
+        </w:rPr>
+        <w:t>21</w:t>
+      </w:r>
+      <w:r>
+        <w:t>(5), 895–912.</w:t>
+      </w:r>
+    </w:p>
+    <w:p>
+      <w:pPr>
+        <w:pStyle w:val="ListParagraph"/>
+        <w:numPr>
+          <w:ilvl w:val="0"/>
+          <w:numId w:val="9"/>
+        </w:numPr>
+      </w:pPr>
+      <w:proofErr w:type="spellStart"/>
+      <w:r>
         <w:t>Cormen</w:t>
       </w:r>
       <w:proofErr w:type="spellEnd"/>
       <w:r>
-        <w:t xml:space="preserve">, C. E. </w:t>
+        <w:t xml:space="preserve">, T. H., </w:t>
       </w:r>
       <w:proofErr w:type="spellStart"/>
       <w:r>
@@ -54,384 +224,163 @@
       </w:r>
       <w:proofErr w:type="spellEnd"/>
       <w:r>
-        <w:t>, R. L. Rivest, and C. Stein, Introduction to Algorithms, 4th ed., MIT Press.</w:t>
-      </w:r>
-    </w:p>
-    <w:p>
-      <w:r>
-        <w:t xml:space="preserve">[4] M. </w:t>
-      </w:r>
+        <w:t xml:space="preserve">, C. E., Rivest, R. L., &amp; Stein, C. (2009). </w:t>
+      </w:r>
+      <w:r>
+        <w:rPr>
+          <w:i/>
+          <w:iCs/>
+        </w:rPr>
+        <w:t>Introduction to algorithms</w:t>
+      </w:r>
+      <w:r>
+        <w:t xml:space="preserve"> (3rd ed.). MIT Press.</w:t>
+      </w:r>
+    </w:p>
+    <w:p>
+      <w:pPr>
+        <w:pStyle w:val="ListParagraph"/>
+        <w:numPr>
+          <w:ilvl w:val="0"/>
+          <w:numId w:val="9"/>
+        </w:numPr>
+      </w:pPr>
       <w:proofErr w:type="spellStart"/>
       <w:r>
-        <w:t>Stoer</w:t>
+        <w:t>Cormen</w:t>
       </w:r>
       <w:proofErr w:type="spellEnd"/>
       <w:r>
-        <w:t xml:space="preserve"> and F. Wagner, “A Simple Min-Cut Algorithm,” Journal of the ACM, 44(4), 1997.</w:t>
-      </w:r>
-    </w:p>
-    <w:p>
-      <w:r>
-        <w:t xml:space="preserve">[5] R. K. Ahuja, T. L. </w:t>
+        <w:t xml:space="preserve">, T. H., </w:t>
       </w:r>
       <w:proofErr w:type="spellStart"/>
       <w:r>
-        <w:t>Magnanti</w:t>
+        <w:t>Leiserson</w:t>
       </w:r>
       <w:proofErr w:type="spellEnd"/>
       <w:r>
-        <w:t>, and J. B. Orlin, Network Flows: Theory, Algorithms, and Applications, 1993.</w:t>
-      </w:r>
-    </w:p>
-    <w:p>
-      <w:r>
-        <w:t xml:space="preserve">[6] E. </w:t>
+        <w:t xml:space="preserve">, C. E., Rivest, R. L., &amp; Stein, C. (2022). </w:t>
+      </w:r>
+      <w:r>
+        <w:rPr>
+          <w:i/>
+          <w:iCs/>
+        </w:rPr>
+        <w:t>Introduction to algorithms</w:t>
+      </w:r>
+      <w:r>
+        <w:t xml:space="preserve"> (4th ed.). MIT Press.</w:t>
+      </w:r>
+    </w:p>
+    <w:p>
+      <w:pPr>
+        <w:pStyle w:val="ListParagraph"/>
+        <w:numPr>
+          <w:ilvl w:val="0"/>
+          <w:numId w:val="9"/>
+        </w:numPr>
+      </w:pPr>
+      <w:r>
+        <w:t xml:space="preserve">Dasgupta, S., Papadimitriou, C., &amp; Vazirani, U. (2006). </w:t>
+      </w:r>
+      <w:r>
+        <w:rPr>
+          <w:i/>
+          <w:iCs/>
+        </w:rPr>
+        <w:t>Algorithms</w:t>
+      </w:r>
+      <w:r>
+        <w:t xml:space="preserve">. McGraw-Hill. </w:t>
+      </w:r>
+      <w:hyperlink r:id="rId6" w:tgtFrame="_blank" w:history="1">
+        <w:r>
+          <w:rPr>
+            <w:rStyle w:val="Hyperlink"/>
+          </w:rPr>
+          <w:t>https://people.eecs.berkeley.edu/~vazirani/algorithms/chap2.pdf</w:t>
+        </w:r>
+      </w:hyperlink>
+    </w:p>
+    <w:p>
+      <w:pPr>
+        <w:pStyle w:val="ListParagraph"/>
+        <w:numPr>
+          <w:ilvl w:val="0"/>
+          <w:numId w:val="9"/>
+        </w:numPr>
+      </w:pPr>
+      <w:r>
+        <w:t xml:space="preserve">de Berg, M., Cheong, O., van </w:t>
       </w:r>
       <w:proofErr w:type="spellStart"/>
       <w:r>
-        <w:t>Aarts</w:t>
+        <w:t>Kreveld</w:t>
       </w:r>
       <w:proofErr w:type="spellEnd"/>
       <w:r>
-        <w:t xml:space="preserve"> and J. K. </w:t>
-      </w:r>
+        <w:t xml:space="preserve">, M., &amp; Overmars, M. (2008). </w:t>
+      </w:r>
+      <w:r>
+        <w:rPr>
+          <w:i/>
+          <w:iCs/>
+        </w:rPr>
+        <w:t>Computational geometry: Algorithms and applications</w:t>
+      </w:r>
+      <w:r>
+        <w:t xml:space="preserve"> (3rd ed.). Springer.</w:t>
+      </w:r>
+    </w:p>
+    <w:p>
+      <w:pPr>
+        <w:pStyle w:val="ListParagraph"/>
+        <w:numPr>
+          <w:ilvl w:val="0"/>
+          <w:numId w:val="9"/>
+        </w:numPr>
+      </w:pPr>
+      <w:r>
+        <w:t xml:space="preserve">Gardner, M. (1978). </w:t>
+      </w:r>
+      <w:r>
+        <w:rPr>
+          <w:i/>
+          <w:iCs/>
+        </w:rPr>
+        <w:t>Aha! Insight</w:t>
+      </w:r>
+      <w:r>
+        <w:t>. W. H. Freeman.</w:t>
+      </w:r>
+    </w:p>
+    <w:p>
+      <w:pPr>
+        <w:pStyle w:val="ListParagraph"/>
+        <w:numPr>
+          <w:ilvl w:val="0"/>
+          <w:numId w:val="9"/>
+        </w:numPr>
+      </w:pPr>
       <w:proofErr w:type="spellStart"/>
       <w:r>
-        <w:t>Lenstra</w:t>
+        <w:t>GeeksforGeeks</w:t>
       </w:r>
       <w:proofErr w:type="spellEnd"/>
       <w:r>
-        <w:t xml:space="preserve"> (eds.), Local Search in Combinatorial Optimization, Princeton University Press, 2003.</w:t>
-      </w:r>
-    </w:p>
-    <w:p>
-      <w:r>
-        <w:t xml:space="preserve">[7] E.-G. </w:t>
-      </w:r>
-      <w:proofErr w:type="spellStart"/>
-      <w:r>
-        <w:t>Talbi</w:t>
-      </w:r>
-      <w:proofErr w:type="spellEnd"/>
-      <w:r>
-        <w:t>, Metaheuristics: From Design to Implementation, Wiley, 2009.</w:t>
-      </w:r>
-    </w:p>
-    <w:p/>
-    <w:p>
-      <w:pPr>
-        <w:pStyle w:val="ListParagraph"/>
-        <w:numPr>
-          <w:ilvl w:val="0"/>
-          <w:numId w:val="4"/>
-        </w:numPr>
-        <w:jc w:val="both"/>
-      </w:pPr>
-      <w:r>
-        <w:t xml:space="preserve">Wikipedia contributors. "Stirling numbers of the second kind." </w:t>
-      </w:r>
-      <w:r>
-        <w:rPr>
-          <w:i/>
-          <w:iCs/>
-        </w:rPr>
-        <w:t>Wikipedia, The Free Encyclopedia</w:t>
-      </w:r>
-      <w:r>
-        <w:t>. Wikipedia, The Free Encyclopedia, 30 Apr. 2026. Web. 4 May. 2026.</w:t>
-      </w:r>
-    </w:p>
-    <w:p>
-      <w:pPr>
-        <w:pStyle w:val="ListParagraph"/>
-        <w:numPr>
-          <w:ilvl w:val="0"/>
-          <w:numId w:val="4"/>
-        </w:numPr>
-        <w:jc w:val="both"/>
-      </w:pPr>
-      <w:proofErr w:type="spellStart"/>
-      <w:r>
-        <w:t>Leskovec</w:t>
-      </w:r>
-      <w:proofErr w:type="spellEnd"/>
-      <w:r>
-        <w:t xml:space="preserve">, J., &amp; Rajaraman, A. (n.d.). </w:t>
-      </w:r>
-      <w:r>
-        <w:rPr>
-          <w:i/>
-          <w:iCs/>
-        </w:rPr>
-        <w:t>Clustering Algorithms</w:t>
-      </w:r>
-      <w:r>
-        <w:t xml:space="preserve"> [Lecture slides]. CS345a: Data Mining, Stanford University.</w:t>
-      </w:r>
-    </w:p>
-    <w:p>
-      <w:pPr>
-        <w:pStyle w:val="ListParagraph"/>
-        <w:numPr>
-          <w:ilvl w:val="0"/>
-          <w:numId w:val="4"/>
-        </w:numPr>
-        <w:spacing w:before="240" w:after="120" w:line="360" w:lineRule="auto"/>
-        <w:jc w:val="both"/>
-      </w:pPr>
-      <w:r>
-        <w:rPr>
-          <w:color w:val="000000"/>
-        </w:rPr>
-        <w:t xml:space="preserve">[1] </w:t>
-      </w:r>
-      <w:proofErr w:type="spellStart"/>
-      <w:r>
-        <w:rPr>
-          <w:color w:val="000000"/>
-        </w:rPr>
-        <w:t>Bousch</w:t>
-      </w:r>
-      <w:proofErr w:type="spellEnd"/>
-      <w:r>
-        <w:rPr>
-          <w:color w:val="000000"/>
-        </w:rPr>
-        <w:t xml:space="preserve">, T. (2014). La </w:t>
-      </w:r>
-      <w:proofErr w:type="spellStart"/>
-      <w:r>
-        <w:rPr>
-          <w:color w:val="000000"/>
-        </w:rPr>
-        <w:t>quatrieme</w:t>
-      </w:r>
-      <w:proofErr w:type="spellEnd"/>
-      <w:r>
-        <w:rPr>
-          <w:color w:val="000000"/>
-        </w:rPr>
-        <w:t xml:space="preserve"> tour de Hanoi. Bulletin of the Belgian Mathematical Society, 21(5), 895–912. Provides the most rigorous partial proof of the Frame-Stewart conjecture.</w:t>
-      </w:r>
-    </w:p>
-    <w:p>
-      <w:pPr>
-        <w:pStyle w:val="ListParagraph"/>
-        <w:numPr>
-          <w:ilvl w:val="0"/>
-          <w:numId w:val="4"/>
-        </w:numPr>
-        <w:spacing w:before="240" w:after="120" w:line="360" w:lineRule="auto"/>
-        <w:jc w:val="both"/>
-      </w:pPr>
-      <w:r>
-        <w:rPr>
-          <w:color w:val="000000"/>
-        </w:rPr>
-        <w:t xml:space="preserve">[2] </w:t>
-      </w:r>
-      <w:proofErr w:type="spellStart"/>
-      <w:r>
-        <w:rPr>
-          <w:color w:val="000000"/>
-        </w:rPr>
-        <w:t>Cormen</w:t>
-      </w:r>
-      <w:proofErr w:type="spellEnd"/>
-      <w:r>
-        <w:rPr>
-          <w:color w:val="000000"/>
-        </w:rPr>
-        <w:t xml:space="preserve">, T. H., </w:t>
-      </w:r>
-      <w:proofErr w:type="spellStart"/>
-      <w:r>
-        <w:rPr>
-          <w:color w:val="000000"/>
-        </w:rPr>
-        <w:t>Leiserson</w:t>
-      </w:r>
-      <w:proofErr w:type="spellEnd"/>
-      <w:r>
-        <w:rPr>
-          <w:color w:val="000000"/>
-        </w:rPr>
-        <w:t>, C. E., Rivest, R. L., &amp; Stein, C. (2022). Introduction to Algorithms (4th ed.). MIT Press. Standard reference for dynamic programming and algorithm complexity (Chapter 14 on DP; Chapter 22 on BFS).</w:t>
-      </w:r>
-    </w:p>
-    <w:p>
-      <w:pPr>
-        <w:pStyle w:val="ListParagraph"/>
-        <w:numPr>
-          <w:ilvl w:val="0"/>
-          <w:numId w:val="4"/>
-        </w:numPr>
-        <w:spacing w:before="240" w:after="120" w:line="360" w:lineRule="auto"/>
-        <w:jc w:val="both"/>
-      </w:pPr>
-      <w:r>
-        <w:rPr>
-          <w:color w:val="000000"/>
-        </w:rPr>
-        <w:t>[3] Korf, R. E. (1985). Depth-first iterative deepening: An optimal admissible tree search. Artificial Intelligence, 27(1), 97–109. Original paper introducing IDA*.</w:t>
-      </w:r>
-    </w:p>
-    <w:p>
-      <w:pPr>
-        <w:pStyle w:val="ListParagraph"/>
-        <w:numPr>
-          <w:ilvl w:val="0"/>
-          <w:numId w:val="4"/>
-        </w:numPr>
-        <w:spacing w:before="240" w:after="120" w:line="360" w:lineRule="auto"/>
-        <w:jc w:val="both"/>
-      </w:pPr>
-      <w:r>
-        <w:rPr>
-          <w:color w:val="000000"/>
-        </w:rPr>
-        <w:t>[4] Levitin, A. (2011). Introduction to the Design and Analysis of Algorithms (3rd ed.). Pearson. Covers divide and conquer (Chapter 4) and dynamic programming (Chapter 8).</w:t>
-      </w:r>
-    </w:p>
-    <w:p>
-      <w:pPr>
-        <w:pStyle w:val="ListParagraph"/>
-        <w:numPr>
-          <w:ilvl w:val="0"/>
-          <w:numId w:val="4"/>
-        </w:numPr>
-        <w:spacing w:before="240" w:after="120" w:line="360" w:lineRule="auto"/>
-        <w:jc w:val="both"/>
-      </w:pPr>
-      <w:r>
-        <w:rPr>
-          <w:color w:val="000000"/>
-        </w:rPr>
-        <w:t>[5] Pearl, J. (1984). Heuristics: Intelligent Search Strategies for Computer Problem Solving. Addison-Wesley. Foundational reference for A* search and admissible heuristics.</w:t>
-      </w:r>
-    </w:p>
-    <w:p>
-      <w:pPr>
-        <w:pStyle w:val="ListParagraph"/>
-        <w:numPr>
-          <w:ilvl w:val="0"/>
-          <w:numId w:val="4"/>
-        </w:numPr>
-        <w:spacing w:before="240" w:after="120" w:line="360" w:lineRule="auto"/>
-        <w:jc w:val="both"/>
-      </w:pPr>
-      <w:r>
-        <w:rPr>
-          <w:color w:val="000000"/>
-        </w:rPr>
-        <w:lastRenderedPageBreak/>
-        <w:t>[6] Russell, S., &amp; Norvig, P. (2020). Artificial Intelligence: A Modern Approach (4th ed.). Pearson. Chapter 3 covers BFS, A*, IDA*, and heuristic design.</w:t>
-      </w:r>
-    </w:p>
-    <w:p>
-      <w:pPr>
-        <w:pStyle w:val="ListParagraph"/>
-        <w:numPr>
-          <w:ilvl w:val="0"/>
-          <w:numId w:val="4"/>
-        </w:numPr>
-        <w:spacing w:before="240" w:after="120" w:line="360" w:lineRule="auto"/>
-        <w:jc w:val="both"/>
-      </w:pPr>
-      <w:r>
-        <w:rPr>
-          <w:color w:val="000000"/>
-        </w:rPr>
-        <w:t>[7] Stewart, B. M. (1941). Solution to problem 3918. American Mathematical Monthly, 48(3), 217–219. Companion solution to Frame's original paper, establishing the independent discovery of the algorithm.</w:t>
-      </w:r>
-    </w:p>
-    <w:p>
-      <w:pPr>
-        <w:pStyle w:val="ListParagraph"/>
-        <w:numPr>
-          <w:ilvl w:val="0"/>
-          <w:numId w:val="4"/>
-        </w:numPr>
-        <w:spacing w:before="60" w:after="60" w:line="276" w:lineRule="auto"/>
-        <w:contextualSpacing w:val="0"/>
-        <w:jc w:val="both"/>
-      </w:pPr>
-      <w:r>
-        <w:t>Levitin, A. (2012). Introduction to The Design and Analysis of Algorithms (3rd ed.). Pearson.</w:t>
-      </w:r>
-    </w:p>
-    <w:p>
-      <w:pPr>
-        <w:pStyle w:val="ListParagraph"/>
-        <w:numPr>
-          <w:ilvl w:val="0"/>
-          <w:numId w:val="4"/>
-        </w:numPr>
-        <w:spacing w:before="60" w:after="60" w:line="276" w:lineRule="auto"/>
-        <w:contextualSpacing w:val="0"/>
-        <w:jc w:val="both"/>
-      </w:pPr>
-      <w:proofErr w:type="spellStart"/>
-      <w:r>
-        <w:t>Cormen</w:t>
-      </w:r>
-      <w:proofErr w:type="spellEnd"/>
-      <w:r>
-        <w:t xml:space="preserve">, T. H., </w:t>
-      </w:r>
-      <w:proofErr w:type="spellStart"/>
-      <w:r>
-        <w:t>Leiserson</w:t>
-      </w:r>
-      <w:proofErr w:type="spellEnd"/>
-      <w:r>
-        <w:t>, C. E., Rivest, R. L., &amp; Stein, C. (2009). Introduction to Algorithms (3rd ed.). MIT Press.</w:t>
-      </w:r>
-    </w:p>
-    <w:p>
-      <w:pPr>
-        <w:pStyle w:val="ListParagraph"/>
-        <w:numPr>
-          <w:ilvl w:val="0"/>
-          <w:numId w:val="4"/>
-        </w:numPr>
-        <w:spacing w:before="60" w:after="60" w:line="276" w:lineRule="auto"/>
-        <w:contextualSpacing w:val="0"/>
-        <w:jc w:val="both"/>
-      </w:pPr>
-      <w:proofErr w:type="spellStart"/>
-      <w:r>
-        <w:t>Pinedo</w:t>
-      </w:r>
-      <w:proofErr w:type="spellEnd"/>
-      <w:r>
-        <w:t>, M. L. (2016). Scheduling: Theory, Algorithms, and Systems (5th ed.). Springer.</w:t>
-      </w:r>
-    </w:p>
-    <w:p>
-      <w:pPr>
-        <w:pStyle w:val="ListParagraph"/>
-        <w:numPr>
-          <w:ilvl w:val="0"/>
-          <w:numId w:val="4"/>
-        </w:numPr>
-        <w:spacing w:before="60" w:after="60" w:line="276" w:lineRule="auto"/>
-        <w:contextualSpacing w:val="0"/>
-        <w:jc w:val="both"/>
-        <w:rPr>
-          <w:rStyle w:val="Hyperlink"/>
-          <w:color w:val="auto"/>
-        </w:rPr>
-      </w:pPr>
-      <w:proofErr w:type="spellStart"/>
-      <w:r>
-        <w:t>GeeksforGeeks</w:t>
-      </w:r>
-      <w:proofErr w:type="spellEnd"/>
-      <w:r>
-        <w:t xml:space="preserve">. (2024). Job Sequencing Problem. </w:t>
-      </w:r>
-      <w:hyperlink r:id="rId6" w:history="1">
+        <w:t xml:space="preserve">. (2024). </w:t>
+      </w:r>
+      <w:r>
+        <w:rPr>
+          <w:i/>
+          <w:iCs/>
+        </w:rPr>
+        <w:t>Job sequencing problem</w:t>
+      </w:r>
+      <w:r>
+        <w:t xml:space="preserve">. </w:t>
+      </w:r>
+      <w:hyperlink r:id="rId7" w:tgtFrame="_blank" w:history="1">
         <w:r>
           <w:rPr>
             <w:rStyle w:val="Hyperlink"/>
@@ -445,88 +394,28 @@
         <w:pStyle w:val="ListParagraph"/>
         <w:numPr>
           <w:ilvl w:val="0"/>
-          <w:numId w:val="4"/>
-        </w:numPr>
-        <w:spacing w:before="120" w:after="60" w:line="360" w:lineRule="auto"/>
-        <w:contextualSpacing w:val="0"/>
-        <w:jc w:val="both"/>
-        <w:rPr>
-          <w:szCs w:val="24"/>
-        </w:rPr>
-      </w:pPr>
-      <w:r>
-        <w:rPr>
-          <w:color w:val="000000"/>
-        </w:rPr>
-        <w:t>Levitin, A. (2012). Introduction to the Design and Analysis of Algorithms (3rd ed.). Pearson.</w:t>
-      </w:r>
-    </w:p>
-    <w:p>
-      <w:pPr>
-        <w:pStyle w:val="ListParagraph"/>
-        <w:numPr>
-          <w:ilvl w:val="0"/>
-          <w:numId w:val="4"/>
-        </w:numPr>
-        <w:spacing w:before="120" w:after="60" w:line="360" w:lineRule="auto"/>
-        <w:contextualSpacing w:val="0"/>
-        <w:jc w:val="both"/>
+          <w:numId w:val="9"/>
+        </w:numPr>
       </w:pPr>
       <w:proofErr w:type="spellStart"/>
       <w:r>
-        <w:rPr>
-          <w:color w:val="000000"/>
-        </w:rPr>
-        <w:t>Cormen</w:t>
+        <w:t>GeeksforGeeks</w:t>
       </w:r>
       <w:proofErr w:type="spellEnd"/>
       <w:r>
-        <w:rPr>
-          <w:color w:val="000000"/>
-        </w:rPr>
-        <w:t xml:space="preserve">, T. H., </w:t>
-      </w:r>
-      <w:proofErr w:type="spellStart"/>
-      <w:r>
-        <w:rPr>
-          <w:color w:val="000000"/>
-        </w:rPr>
-        <w:t>Leiserson</w:t>
-      </w:r>
-      <w:proofErr w:type="spellEnd"/>
-      <w:r>
-        <w:rPr>
-          <w:color w:val="000000"/>
-        </w:rPr>
-        <w:t>, C. E., Rivest, R. L., &amp; Stein, C. (2009). Introduction to Algorithms (3rd ed.). MIT Press.</w:t>
-      </w:r>
-    </w:p>
-    <w:p>
-      <w:pPr>
-        <w:pStyle w:val="ListParagraph"/>
-        <w:numPr>
-          <w:ilvl w:val="0"/>
-          <w:numId w:val="4"/>
-        </w:numPr>
-        <w:spacing w:before="120" w:after="60" w:line="360" w:lineRule="auto"/>
-        <w:contextualSpacing w:val="0"/>
-        <w:jc w:val="both"/>
-      </w:pPr>
-      <w:proofErr w:type="spellStart"/>
-      <w:r>
-        <w:rPr>
-          <w:color w:val="000000"/>
-        </w:rPr>
-        <w:t>GeeksforGeeks</w:t>
-      </w:r>
-      <w:proofErr w:type="spellEnd"/>
-      <w:r>
-        <w:rPr>
-          <w:color w:val="000000"/>
-        </w:rPr>
-        <w:t xml:space="preserve">. (2026). Introduction to Divide and Conquer Algorithm. </w:t>
-      </w:r>
-      <w:hyperlink r:id="rId7" w:history="1">
+        <w:t xml:space="preserve">. (2026). </w:t>
+      </w:r>
+      <w:r>
+        <w:rPr>
+          <w:i/>
+          <w:iCs/>
+        </w:rPr>
+        <w:t>Introduction to divide and conquer algorithm</w:t>
+      </w:r>
+      <w:r>
+        <w:t xml:space="preserve">. </w:t>
+      </w:r>
+      <w:hyperlink w:tgtFrame="_blank" w:history="1">
         <w:r>
           <w:rPr>
             <w:rStyle w:val="Hyperlink"/>
@@ -540,19 +429,569 @@
         <w:pStyle w:val="ListParagraph"/>
         <w:numPr>
           <w:ilvl w:val="0"/>
-          <w:numId w:val="4"/>
-        </w:numPr>
-        <w:spacing w:before="120" w:after="60" w:line="360" w:lineRule="auto"/>
-        <w:contextualSpacing w:val="0"/>
-        <w:jc w:val="both"/>
-      </w:pPr>
-      <w:r>
-        <w:rPr>
-          <w:color w:val="000000"/>
-        </w:rPr>
-        <w:t xml:space="preserve">Wikipedia Contributors. (2026). Divide-and-conquer algorithm. Wikipedia. </w:t>
-      </w:r>
-      <w:hyperlink r:id="rId8" w:history="1">
+          <w:numId w:val="9"/>
+        </w:numPr>
+      </w:pPr>
+      <w:proofErr w:type="spellStart"/>
+      <w:r>
+        <w:t>GeeksforGeeks</w:t>
+      </w:r>
+      <w:proofErr w:type="spellEnd"/>
+      <w:r>
+        <w:t xml:space="preserve">. (n.d.). </w:t>
+      </w:r>
+      <w:r>
+        <w:rPr>
+          <w:i/>
+          <w:iCs/>
+        </w:rPr>
+        <w:t>Dynamic programming or DP</w:t>
+      </w:r>
+      <w:r>
+        <w:t xml:space="preserve">. Retrieved from </w:t>
+      </w:r>
+      <w:hyperlink w:tgtFrame="_blank" w:history="1">
+        <w:r>
+          <w:rPr>
+            <w:rStyle w:val="Hyperlink"/>
+          </w:rPr>
+          <w:t>https://www.geeksforgeeks.org/dsa/dynamic-programming/</w:t>
+        </w:r>
+      </w:hyperlink>
+    </w:p>
+    <w:p>
+      <w:pPr>
+        <w:pStyle w:val="ListParagraph"/>
+        <w:numPr>
+          <w:ilvl w:val="0"/>
+          <w:numId w:val="9"/>
+        </w:numPr>
+      </w:pPr>
+      <w:proofErr w:type="spellStart"/>
+      <w:r>
+        <w:t>Golomb</w:t>
+      </w:r>
+      <w:proofErr w:type="spellEnd"/>
+      <w:r>
+        <w:t xml:space="preserve">, S. W. (1954). Checker boards and polyominoes. </w:t>
+      </w:r>
+      <w:r>
+        <w:rPr>
+          <w:i/>
+          <w:iCs/>
+        </w:rPr>
+        <w:t>American Mathematical Monthly</w:t>
+      </w:r>
+      <w:r>
+        <w:t xml:space="preserve">, </w:t>
+      </w:r>
+      <w:r>
+        <w:rPr>
+          <w:i/>
+          <w:iCs/>
+        </w:rPr>
+        <w:t>61</w:t>
+      </w:r>
+      <w:r>
+        <w:t>(10), 675–682.</w:t>
+      </w:r>
+    </w:p>
+    <w:p>
+      <w:pPr>
+        <w:pStyle w:val="ListParagraph"/>
+        <w:numPr>
+          <w:ilvl w:val="0"/>
+          <w:numId w:val="9"/>
+        </w:numPr>
+      </w:pPr>
+      <w:proofErr w:type="spellStart"/>
+      <w:r>
+        <w:t>Golomb</w:t>
+      </w:r>
+      <w:proofErr w:type="spellEnd"/>
+      <w:r>
+        <w:t xml:space="preserve">, S. W. (1994). </w:t>
+      </w:r>
+      <w:r>
+        <w:rPr>
+          <w:i/>
+          <w:iCs/>
+        </w:rPr>
+        <w:t>Polyominoes: Puzzles, patterns, problems, and packings</w:t>
+      </w:r>
+      <w:r>
+        <w:t xml:space="preserve"> (2nd ed.). Princeton University Press.</w:t>
+      </w:r>
+    </w:p>
+    <w:p>
+      <w:pPr>
+        <w:pStyle w:val="ListParagraph"/>
+        <w:numPr>
+          <w:ilvl w:val="0"/>
+          <w:numId w:val="9"/>
+        </w:numPr>
+      </w:pPr>
+      <w:proofErr w:type="spellStart"/>
+      <w:r>
+        <w:t>Iacono</w:t>
+      </w:r>
+      <w:proofErr w:type="spellEnd"/>
+      <w:r>
+        <w:t xml:space="preserve">, A. (2017, October 7). </w:t>
+      </w:r>
+      <w:r>
+        <w:rPr>
+          <w:i/>
+          <w:iCs/>
+        </w:rPr>
+        <w:t>Backtracking explained</w:t>
+      </w:r>
+      <w:r>
+        <w:t xml:space="preserve">. Medium. </w:t>
+      </w:r>
+      <w:hyperlink w:tgtFrame="_blank" w:history="1">
+        <w:r>
+          <w:rPr>
+            <w:rStyle w:val="Hyperlink"/>
+          </w:rPr>
+          <w:t>https://medium.com/@andreaiacono/backtracking-explained-7450d6ef9e1a</w:t>
+        </w:r>
+      </w:hyperlink>
+    </w:p>
+    <w:p>
+      <w:pPr>
+        <w:pStyle w:val="ListParagraph"/>
+        <w:numPr>
+          <w:ilvl w:val="0"/>
+          <w:numId w:val="9"/>
+        </w:numPr>
+      </w:pPr>
+      <w:r>
+        <w:t xml:space="preserve">Knuth, D. E. (1997). </w:t>
+      </w:r>
+      <w:r>
+        <w:rPr>
+          <w:i/>
+          <w:iCs/>
+        </w:rPr>
+        <w:t>The art of computer programming: Vol. 1. Fundamental algorithms</w:t>
+      </w:r>
+      <w:r>
+        <w:t xml:space="preserve"> (3rd ed.). Addison-Wesley.</w:t>
+      </w:r>
+    </w:p>
+    <w:p>
+      <w:pPr>
+        <w:pStyle w:val="ListParagraph"/>
+        <w:numPr>
+          <w:ilvl w:val="0"/>
+          <w:numId w:val="9"/>
+        </w:numPr>
+      </w:pPr>
+      <w:r>
+        <w:t xml:space="preserve">Korf, R. E. (1985). Depth-first iterative deepening: An optimal admissible tree search. </w:t>
+      </w:r>
+      <w:r>
+        <w:rPr>
+          <w:i/>
+          <w:iCs/>
+        </w:rPr>
+        <w:t>Artificial Intelligence</w:t>
+      </w:r>
+      <w:r>
+        <w:t xml:space="preserve">, </w:t>
+      </w:r>
+      <w:r>
+        <w:rPr>
+          <w:i/>
+          <w:iCs/>
+        </w:rPr>
+        <w:t>27</w:t>
+      </w:r>
+      <w:r>
+        <w:t>(1), 97–109.</w:t>
+      </w:r>
+    </w:p>
+    <w:p>
+      <w:pPr>
+        <w:pStyle w:val="ListParagraph"/>
+        <w:numPr>
+          <w:ilvl w:val="0"/>
+          <w:numId w:val="9"/>
+        </w:numPr>
+      </w:pPr>
+      <w:proofErr w:type="spellStart"/>
+      <w:r>
+        <w:t>Leskovec</w:t>
+      </w:r>
+      <w:proofErr w:type="spellEnd"/>
+      <w:r>
+        <w:t xml:space="preserve">, J., &amp; Rajaraman, A. (n.d.). </w:t>
+      </w:r>
+      <w:r>
+        <w:rPr>
+          <w:i/>
+          <w:iCs/>
+        </w:rPr>
+        <w:t>Clustering algorithms</w:t>
+      </w:r>
+      <w:r>
+        <w:t xml:space="preserve"> [Lecture slides]. CS345a: Data Mining, Stanford University.</w:t>
+      </w:r>
+    </w:p>
+    <w:p>
+      <w:pPr>
+        <w:pStyle w:val="ListParagraph"/>
+        <w:numPr>
+          <w:ilvl w:val="0"/>
+          <w:numId w:val="9"/>
+        </w:numPr>
+      </w:pPr>
+      <w:r>
+        <w:t xml:space="preserve">Levitin, A. (2012). </w:t>
+      </w:r>
+      <w:r>
+        <w:rPr>
+          <w:i/>
+          <w:iCs/>
+        </w:rPr>
+        <w:t>Introduction to the design and analysis of algorithms</w:t>
+      </w:r>
+      <w:r>
+        <w:t xml:space="preserve"> (3rd ed.). Pearson.</w:t>
+      </w:r>
+    </w:p>
+    <w:p>
+      <w:pPr>
+        <w:pStyle w:val="ListParagraph"/>
+        <w:numPr>
+          <w:ilvl w:val="0"/>
+          <w:numId w:val="9"/>
+        </w:numPr>
+      </w:pPr>
+      <w:r>
+        <w:lastRenderedPageBreak/>
+        <w:t xml:space="preserve">Pearl, J. (1984). </w:t>
+      </w:r>
+      <w:r>
+        <w:rPr>
+          <w:i/>
+          <w:iCs/>
+        </w:rPr>
+        <w:t>Heuristics: Intelligent search strategies for computer problem solving</w:t>
+      </w:r>
+      <w:r>
+        <w:t>. Addison-Wesley.</w:t>
+      </w:r>
+    </w:p>
+    <w:p>
+      <w:pPr>
+        <w:pStyle w:val="ListParagraph"/>
+        <w:numPr>
+          <w:ilvl w:val="0"/>
+          <w:numId w:val="9"/>
+        </w:numPr>
+      </w:pPr>
+      <w:proofErr w:type="spellStart"/>
+      <w:r>
+        <w:t>Pinedo</w:t>
+      </w:r>
+      <w:proofErr w:type="spellEnd"/>
+      <w:r>
+        <w:t xml:space="preserve">, M. L. (2016). </w:t>
+      </w:r>
+      <w:r>
+        <w:rPr>
+          <w:i/>
+          <w:iCs/>
+        </w:rPr>
+        <w:t>Scheduling: Theory, algorithms, and systems</w:t>
+      </w:r>
+      <w:r>
+        <w:t xml:space="preserve"> (5th ed.). Springer.</w:t>
+      </w:r>
+    </w:p>
+    <w:p>
+      <w:pPr>
+        <w:pStyle w:val="ListParagraph"/>
+        <w:numPr>
+          <w:ilvl w:val="0"/>
+          <w:numId w:val="9"/>
+        </w:numPr>
+      </w:pPr>
+      <w:proofErr w:type="spellStart"/>
+      <w:r>
+        <w:t>Preparata</w:t>
+      </w:r>
+      <w:proofErr w:type="spellEnd"/>
+      <w:r>
+        <w:t xml:space="preserve">, F. P., &amp; </w:t>
+      </w:r>
+      <w:proofErr w:type="spellStart"/>
+      <w:r>
+        <w:t>Shamos</w:t>
+      </w:r>
+      <w:proofErr w:type="spellEnd"/>
+      <w:r>
+        <w:t xml:space="preserve">, M. I. (1985). </w:t>
+      </w:r>
+      <w:r>
+        <w:rPr>
+          <w:i/>
+          <w:iCs/>
+        </w:rPr>
+        <w:t>Computational geometry: An introduction</w:t>
+      </w:r>
+      <w:r>
+        <w:t>. Springer.</w:t>
+      </w:r>
+    </w:p>
+    <w:p>
+      <w:pPr>
+        <w:pStyle w:val="ListParagraph"/>
+        <w:numPr>
+          <w:ilvl w:val="0"/>
+          <w:numId w:val="9"/>
+        </w:numPr>
+      </w:pPr>
+      <w:r>
+        <w:t xml:space="preserve">Russell, S., &amp; Norvig, P. (2020). </w:t>
+      </w:r>
+      <w:r>
+        <w:rPr>
+          <w:i/>
+          <w:iCs/>
+        </w:rPr>
+        <w:t>Artificial intelligence: A modern approach</w:t>
+      </w:r>
+      <w:r>
+        <w:t xml:space="preserve"> (4th ed.). Pearson.</w:t>
+      </w:r>
+    </w:p>
+    <w:p>
+      <w:pPr>
+        <w:pStyle w:val="ListParagraph"/>
+        <w:numPr>
+          <w:ilvl w:val="0"/>
+          <w:numId w:val="9"/>
+        </w:numPr>
+      </w:pPr>
+      <w:r>
+        <w:t xml:space="preserve">Sedgewick, R., &amp; Wayne, K. (2011). </w:t>
+      </w:r>
+      <w:r>
+        <w:rPr>
+          <w:i/>
+          <w:iCs/>
+        </w:rPr>
+        <w:t>Algorithms</w:t>
+      </w:r>
+      <w:r>
+        <w:t xml:space="preserve"> (4th ed.). Addison-Wesley.</w:t>
+      </w:r>
+    </w:p>
+    <w:p>
+      <w:pPr>
+        <w:pStyle w:val="ListParagraph"/>
+        <w:numPr>
+          <w:ilvl w:val="0"/>
+          <w:numId w:val="9"/>
+        </w:numPr>
+      </w:pPr>
+      <w:proofErr w:type="spellStart"/>
+      <w:r>
+        <w:t>Skiena</w:t>
+      </w:r>
+      <w:proofErr w:type="spellEnd"/>
+      <w:r>
+        <w:t xml:space="preserve">, S. S. (2008). </w:t>
+      </w:r>
+      <w:r>
+        <w:rPr>
+          <w:i/>
+          <w:iCs/>
+        </w:rPr>
+        <w:t>The algorithm design manual</w:t>
+      </w:r>
+      <w:r>
+        <w:t xml:space="preserve"> (2nd ed.). Springer.</w:t>
+      </w:r>
+    </w:p>
+    <w:p>
+      <w:pPr>
+        <w:pStyle w:val="ListParagraph"/>
+        <w:numPr>
+          <w:ilvl w:val="0"/>
+          <w:numId w:val="9"/>
+        </w:numPr>
+      </w:pPr>
+      <w:r>
+        <w:t xml:space="preserve">Stewart, B. M. (1941). Solution to problem 3918. </w:t>
+      </w:r>
+      <w:r>
+        <w:rPr>
+          <w:i/>
+          <w:iCs/>
+        </w:rPr>
+        <w:t>American Mathematical Monthly</w:t>
+      </w:r>
+      <w:r>
+        <w:t xml:space="preserve">, </w:t>
+      </w:r>
+      <w:r>
+        <w:rPr>
+          <w:i/>
+          <w:iCs/>
+        </w:rPr>
+        <w:t>48</w:t>
+      </w:r>
+      <w:r>
+        <w:t>(3), 217–219.</w:t>
+      </w:r>
+    </w:p>
+    <w:p>
+      <w:pPr>
+        <w:pStyle w:val="ListParagraph"/>
+        <w:numPr>
+          <w:ilvl w:val="0"/>
+          <w:numId w:val="9"/>
+        </w:numPr>
+      </w:pPr>
+      <w:proofErr w:type="spellStart"/>
+      <w:r>
+        <w:t>Stoer</w:t>
+      </w:r>
+      <w:proofErr w:type="spellEnd"/>
+      <w:r>
+        <w:t xml:space="preserve">, M., &amp; Wagner, F. (1997). A simple min-cut algorithm. </w:t>
+      </w:r>
+      <w:r>
+        <w:rPr>
+          <w:i/>
+          <w:iCs/>
+        </w:rPr>
+        <w:t>Journal of the ACM</w:t>
+      </w:r>
+      <w:r>
+        <w:t xml:space="preserve">, </w:t>
+      </w:r>
+      <w:r>
+        <w:rPr>
+          <w:i/>
+          <w:iCs/>
+        </w:rPr>
+        <w:t>44</w:t>
+      </w:r>
+      <w:r>
+        <w:t>(4), 585–591.</w:t>
+      </w:r>
+    </w:p>
+    <w:p>
+      <w:pPr>
+        <w:pStyle w:val="ListParagraph"/>
+        <w:numPr>
+          <w:ilvl w:val="0"/>
+          <w:numId w:val="9"/>
+        </w:numPr>
+      </w:pPr>
+      <w:proofErr w:type="spellStart"/>
+      <w:r>
+        <w:t>Stroustrup</w:t>
+      </w:r>
+      <w:proofErr w:type="spellEnd"/>
+      <w:r>
+        <w:t xml:space="preserve">, B. (2013). </w:t>
+      </w:r>
+      <w:r>
+        <w:rPr>
+          <w:i/>
+          <w:iCs/>
+        </w:rPr>
+        <w:t>The C++ programming language</w:t>
+      </w:r>
+      <w:r>
+        <w:t xml:space="preserve"> (4th ed.). Addison-Wesley.</w:t>
+      </w:r>
+    </w:p>
+    <w:p>
+      <w:pPr>
+        <w:pStyle w:val="ListParagraph"/>
+        <w:numPr>
+          <w:ilvl w:val="0"/>
+          <w:numId w:val="9"/>
+        </w:numPr>
+      </w:pPr>
+      <w:proofErr w:type="spellStart"/>
+      <w:r>
+        <w:t>Talbi</w:t>
+      </w:r>
+      <w:proofErr w:type="spellEnd"/>
+      <w:r>
+        <w:t xml:space="preserve">, E.-G. (2009). </w:t>
+      </w:r>
+      <w:r>
+        <w:rPr>
+          <w:i/>
+          <w:iCs/>
+        </w:rPr>
+        <w:t>Metaheuristics: From design to implementation</w:t>
+      </w:r>
+      <w:r>
+        <w:t>. Wiley.</w:t>
+      </w:r>
+    </w:p>
+    <w:p>
+      <w:pPr>
+        <w:pStyle w:val="ListParagraph"/>
+        <w:numPr>
+          <w:ilvl w:val="0"/>
+          <w:numId w:val="9"/>
+        </w:numPr>
+      </w:pPr>
+      <w:r>
+        <w:t xml:space="preserve">Wikipedia contributors. (2026, April 30). </w:t>
+      </w:r>
+      <w:r>
+        <w:rPr>
+          <w:i/>
+          <w:iCs/>
+        </w:rPr>
+        <w:t>Stirling numbers of the second kind</w:t>
+      </w:r>
+      <w:r>
+        <w:t xml:space="preserve">. Wikipedia, The Free Encyclopedia. </w:t>
+      </w:r>
+      <w:hyperlink w:tgtFrame="_blank" w:history="1">
+        <w:r>
+          <w:rPr>
+            <w:rStyle w:val="Hyperlink"/>
+          </w:rPr>
+          <w:t>https://en.wikipedia.org/wiki/Stirling_numbers_of_the_second_kind</w:t>
+        </w:r>
+      </w:hyperlink>
+    </w:p>
+    <w:p>
+      <w:pPr>
+        <w:pStyle w:val="ListParagraph"/>
+        <w:numPr>
+          <w:ilvl w:val="0"/>
+          <w:numId w:val="9"/>
+        </w:numPr>
+      </w:pPr>
+      <w:r>
+        <w:t xml:space="preserve">Wikipedia contributors. (2026, May 4). </w:t>
+      </w:r>
+      <w:r>
+        <w:rPr>
+          <w:i/>
+          <w:iCs/>
+        </w:rPr>
+        <w:t>Divide-and-conquer algorithm</w:t>
+      </w:r>
+      <w:r>
+        <w:t xml:space="preserve">. Wikipedia, The Free Encyclopedia. </w:t>
+      </w:r>
+      <w:hyperlink w:tgtFrame="_blank" w:history="1">
         <w:r>
           <w:rPr>
             <w:rStyle w:val="Hyperlink"/>
@@ -566,280 +1005,25 @@
         <w:pStyle w:val="ListParagraph"/>
         <w:numPr>
           <w:ilvl w:val="0"/>
-          <w:numId w:val="4"/>
-        </w:numPr>
-        <w:spacing w:before="120" w:after="60" w:line="360" w:lineRule="auto"/>
-        <w:contextualSpacing w:val="0"/>
-        <w:jc w:val="both"/>
-        <w:rPr>
-          <w:rStyle w:val="Hyperlink"/>
-          <w:color w:val="auto"/>
-          <w:u w:val="none"/>
-        </w:rPr>
-      </w:pPr>
-      <w:r>
-        <w:rPr>
-          <w:color w:val="000000"/>
-        </w:rPr>
-        <w:t xml:space="preserve">Dasgupta, S., Papadimitriou, C., &amp; Vazirani, U. (2006). Algorithms. McGraw-Hill. </w:t>
-      </w:r>
-      <w:hyperlink r:id="rId9" w:history="1">
-        <w:r>
-          <w:rPr>
-            <w:rStyle w:val="Hyperlink"/>
-          </w:rPr>
-          <w:t>https://people.eecs.berkeley.edu/~vazirani/algorithms/chap2.pdf</w:t>
-        </w:r>
-      </w:hyperlink>
-    </w:p>
-    <w:p>
-      <w:pPr>
-        <w:pStyle w:val="ListParagraph"/>
-        <w:numPr>
-          <w:ilvl w:val="0"/>
-          <w:numId w:val="4"/>
-        </w:numPr>
-        <w:spacing w:before="120" w:after="60" w:line="360" w:lineRule="auto"/>
-        <w:jc w:val="both"/>
-      </w:pPr>
-      <w:r>
-        <w:t xml:space="preserve">Arora, A. (2017). Analysis and Design of Algorithms. </w:t>
-      </w:r>
-    </w:p>
-    <w:p>
-      <w:pPr>
-        <w:pStyle w:val="ListParagraph"/>
-        <w:numPr>
-          <w:ilvl w:val="0"/>
-          <w:numId w:val="4"/>
-        </w:numPr>
-        <w:spacing w:before="120" w:after="60" w:line="360" w:lineRule="auto"/>
-        <w:jc w:val="both"/>
-      </w:pPr>
-      <w:r>
-        <w:t xml:space="preserve">Dynamic Programming or DP. (n.d.). Retrieved from </w:t>
+          <w:numId w:val="9"/>
+        </w:numPr>
+      </w:pPr>
+      <w:r>
+        <w:t xml:space="preserve">Wikipedia contributors. (n.d.). </w:t>
       </w:r>
       <w:proofErr w:type="spellStart"/>
       <w:r>
-        <w:t>geeksforgeeks</w:t>
+        <w:rPr>
+          <w:i/>
+          <w:iCs/>
+        </w:rPr>
+        <w:t>Tromino</w:t>
       </w:r>
       <w:proofErr w:type="spellEnd"/>
       <w:r>
-        <w:t>: https://www.geeksforgeeks.org/dsa/dynamic-programming/</w:t>
-      </w:r>
-    </w:p>
-    <w:p>
-      <w:pPr>
-        <w:pStyle w:val="ListParagraph"/>
-        <w:numPr>
-          <w:ilvl w:val="0"/>
-          <w:numId w:val="4"/>
-        </w:numPr>
-        <w:spacing w:before="120" w:after="60" w:line="360" w:lineRule="auto"/>
-        <w:jc w:val="both"/>
-      </w:pPr>
-      <w:proofErr w:type="spellStart"/>
-      <w:r>
-        <w:t>Iacono</w:t>
-      </w:r>
-      <w:proofErr w:type="spellEnd"/>
-      <w:r>
-        <w:t>, A. (2017, oct 7). Backtracking explained. Retrieved from medium: https://medium.com/@andreaiacono/backtracking-explained-7450d6ef9e1a</w:t>
-      </w:r>
-    </w:p>
-    <w:p>
-      <w:pPr>
-        <w:pStyle w:val="ListParagraph"/>
-        <w:numPr>
-          <w:ilvl w:val="0"/>
-          <w:numId w:val="4"/>
-        </w:numPr>
-        <w:spacing w:before="120" w:after="60" w:line="360" w:lineRule="auto"/>
-        <w:jc w:val="both"/>
-      </w:pPr>
-      <w:r>
-        <w:t xml:space="preserve">Levitin, A. (2012). Introduction to the Design and Analysis of Algorithms. </w:t>
-      </w:r>
-    </w:p>
-    <w:p>
-      <w:pPr>
-        <w:pStyle w:val="ListParagraph"/>
-        <w:numPr>
-          <w:ilvl w:val="0"/>
-          <w:numId w:val="4"/>
-        </w:numPr>
-        <w:rPr>
-          <w:rFonts w:cstheme="minorBidi"/>
-          <w:szCs w:val="24"/>
-        </w:rPr>
-      </w:pPr>
-      <w:proofErr w:type="spellStart"/>
-      <w:r>
-        <w:rPr>
-          <w:b/>
-          <w:bCs/>
-        </w:rPr>
-        <w:t>Golomb</w:t>
-      </w:r>
-      <w:proofErr w:type="spellEnd"/>
-      <w:r>
-        <w:rPr>
-          <w:b/>
-          <w:bCs/>
-        </w:rPr>
-        <w:t>, S. W. (1954). "Checker boards and polyominoes".</w:t>
-      </w:r>
-      <w:r>
-        <w:t xml:space="preserve"> </w:t>
-      </w:r>
-      <w:r>
-        <w:rPr>
-          <w:i/>
-          <w:iCs/>
-        </w:rPr>
-        <w:t>American Mathematical Monthly</w:t>
-      </w:r>
-      <w:r>
-        <w:t xml:space="preserve">, 61(10), 675–682. </w:t>
-      </w:r>
-      <w:r>
-        <w:rPr>
-          <w:i/>
-          <w:iCs/>
-        </w:rPr>
-        <w:t xml:space="preserve">(Note: This is the original paper that </w:t>
-      </w:r>
-      <w:r>
-        <w:rPr>
-          <w:i/>
-          <w:iCs/>
-        </w:rPr>
-        <w:lastRenderedPageBreak/>
-        <w:t>mathematically proved the 2</w:t>
-      </w:r>
-      <w:r>
-        <w:rPr>
-          <w:i/>
-          <w:iCs/>
-          <w:vertAlign w:val="superscript"/>
-        </w:rPr>
-        <w:t>n</w:t>
-      </w:r>
-      <w:r>
-        <w:rPr>
-          <w:i/>
-          <w:iCs/>
-        </w:rPr>
-        <w:t xml:space="preserve"> times 2</w:t>
-      </w:r>
-      <w:r>
-        <w:rPr>
-          <w:i/>
-          <w:iCs/>
-          <w:vertAlign w:val="superscript"/>
-        </w:rPr>
-        <w:t>n</w:t>
-      </w:r>
-      <w:r>
-        <w:rPr>
-          <w:i/>
-          <w:iCs/>
-        </w:rPr>
-        <w:t xml:space="preserve"> board can be tiled using divide and conquer algorithm).</w:t>
-      </w:r>
-      <w:r>
-        <w:t xml:space="preserve"> </w:t>
-      </w:r>
-    </w:p>
-    <w:p>
-      <w:pPr>
-        <w:pStyle w:val="ListParagraph"/>
-        <w:numPr>
-          <w:ilvl w:val="0"/>
-          <w:numId w:val="4"/>
-        </w:numPr>
-      </w:pPr>
-      <w:proofErr w:type="spellStart"/>
-      <w:r>
-        <w:rPr>
-          <w:b/>
-          <w:bCs/>
-        </w:rPr>
-        <w:t>Golomb</w:t>
-      </w:r>
-      <w:proofErr w:type="spellEnd"/>
-      <w:r>
-        <w:rPr>
-          <w:b/>
-          <w:bCs/>
-        </w:rPr>
-        <w:t xml:space="preserve">, S. W. (1994). </w:t>
-      </w:r>
-      <w:r>
-        <w:rPr>
-          <w:b/>
-          <w:bCs/>
-          <w:i/>
-          <w:iCs/>
-        </w:rPr>
-        <w:t>Polyominoes: Puzzles, Patterns, Problems, and Packings</w:t>
-      </w:r>
-      <w:r>
-        <w:rPr>
-          <w:b/>
-          <w:bCs/>
-        </w:rPr>
-        <w:t xml:space="preserve"> (2nd ed.).</w:t>
-      </w:r>
-      <w:r>
-        <w:t xml:space="preserve"> Princeton, New Jersey: Princeton University Press. </w:t>
-      </w:r>
-    </w:p>
-    <w:p>
-      <w:pPr>
-        <w:pStyle w:val="ListParagraph"/>
-        <w:numPr>
-          <w:ilvl w:val="0"/>
-          <w:numId w:val="4"/>
-        </w:numPr>
-      </w:pPr>
-      <w:r>
-        <w:rPr>
-          <w:b/>
-          <w:bCs/>
-        </w:rPr>
-        <w:t>Wikipedia contributors. (n.d.). "</w:t>
-      </w:r>
-      <w:proofErr w:type="spellStart"/>
-      <w:r>
-        <w:rPr>
-          <w:b/>
-          <w:bCs/>
-        </w:rPr>
-        <w:t>Tromino</w:t>
-      </w:r>
-      <w:proofErr w:type="spellEnd"/>
-      <w:r>
-        <w:rPr>
-          <w:b/>
-          <w:bCs/>
-        </w:rPr>
-        <w:t>".</w:t>
-      </w:r>
-      <w:r>
-        <w:t xml:space="preserve"> </w:t>
-      </w:r>
-      <w:r>
-        <w:rPr>
-          <w:i/>
-          <w:iCs/>
-        </w:rPr>
-        <w:t>Wikipedia, The Free Encyclopedia</w:t>
-      </w:r>
-      <w:r>
-        <w:t xml:space="preserve">. Retrieved from </w:t>
-      </w:r>
-      <w:hyperlink r:id="rId10" w:tgtFrame="_blank" w:history="1">
+        <w:t xml:space="preserve">. Wikipedia, The Free Encyclopedia. Retrieved May 4, 2026, from </w:t>
+      </w:r>
+      <w:hyperlink w:tgtFrame="_blank" w:history="1">
         <w:r>
           <w:rPr>
             <w:rStyle w:val="Hyperlink"/>
@@ -847,195 +1031,7 @@
           <w:t>https://en.wikipedia.org/wiki/Tromino</w:t>
         </w:r>
       </w:hyperlink>
-      <w:r>
-        <w:t xml:space="preserve"> </w:t>
-      </w:r>
-      <w:r>
-        <w:rPr>
-          <w:i/>
-          <w:iCs/>
-        </w:rPr>
-        <w:t xml:space="preserve">(Note: Good general reference for </w:t>
-      </w:r>
-      <w:proofErr w:type="spellStart"/>
-      <w:r>
-        <w:rPr>
-          <w:i/>
-          <w:iCs/>
-        </w:rPr>
-        <w:t>Golomb's</w:t>
-      </w:r>
-      <w:proofErr w:type="spellEnd"/>
-      <w:r>
-        <w:rPr>
-          <w:i/>
-          <w:iCs/>
-        </w:rPr>
-        <w:t xml:space="preserve"> theorem and rep-tiling).</w:t>
-      </w:r>
-    </w:p>
-    <w:p>
-      <w:pPr>
-        <w:pStyle w:val="ListParagraph"/>
-        <w:numPr>
-          <w:ilvl w:val="0"/>
-          <w:numId w:val="4"/>
-        </w:numPr>
-        <w:spacing w:before="120" w:after="60" w:line="360" w:lineRule="auto"/>
-        <w:jc w:val="both"/>
-      </w:pPr>
-    </w:p>
-    <w:p>
-      <w:pPr>
-        <w:pStyle w:val="ListParagraph"/>
-        <w:spacing w:before="60" w:after="60" w:line="276" w:lineRule="auto"/>
-        <w:ind w:left="360"/>
-        <w:contextualSpacing w:val="0"/>
-        <w:jc w:val="both"/>
-        <w:rPr>
-          <w:u w:val="single"/>
-        </w:rPr>
-      </w:pPr>
-    </w:p>
-    <w:p>
-      <w:r>
-        <w:t xml:space="preserve">[1]  T. H. </w:t>
-      </w:r>
-      <w:proofErr w:type="spellStart"/>
-      <w:r>
-        <w:t>Cormen</w:t>
-      </w:r>
-      <w:proofErr w:type="spellEnd"/>
-      <w:r>
-        <w:t xml:space="preserve">, C. E. </w:t>
-      </w:r>
-      <w:proofErr w:type="spellStart"/>
-      <w:r>
-        <w:t>Leiserson</w:t>
-      </w:r>
-      <w:proofErr w:type="spellEnd"/>
-      <w:r>
-        <w:t>, R. L. Rivest, and C. Stein, Introduction to Algorithms, 4th ed. Cambridge, MA: MIT Press, 2022.</w:t>
-      </w:r>
-    </w:p>
-    <w:p>
-      <w:r>
-        <w:t xml:space="preserve">[2]  S. S. </w:t>
-      </w:r>
-      <w:proofErr w:type="spellStart"/>
-      <w:r>
-        <w:t>Skiena</w:t>
-      </w:r>
-      <w:proofErr w:type="spellEnd"/>
-      <w:r>
-        <w:t>, The Algorithm Design Manual, 2nd ed. New York: Springer, 2008.</w:t>
-      </w:r>
-    </w:p>
-    <w:p>
-      <w:r>
-        <w:t xml:space="preserve">[3]  M. Gardner, Aha! Insight. New York: W. H. Freeman, 1978. [Original source of the 9-dots puzzle and its </w:t>
-      </w:r>
-      <w:proofErr w:type="spellStart"/>
-      <w:r>
-        <w:t>generalisations</w:t>
-      </w:r>
-      <w:proofErr w:type="spellEnd"/>
-      <w:r>
-        <w:t>.]</w:t>
-      </w:r>
-    </w:p>
-    <w:p>
-      <w:r>
-        <w:t>[4]  D. E. Knuth, The Art of Computer Programming, Vol. 1: Fundamental Algorithms, 3rd ed. Boston: Addison-Wesley, 1997.</w:t>
-      </w:r>
-    </w:p>
-    <w:p>
-      <w:r>
-        <w:t>[5]  S. Russell and P. Norvig, Artificial Intelligence: A Modern Approach, 4th ed. Hoboken, NJ: Pearson, 2020. [Chapter 3: Solving Problems by Searching.]</w:t>
-      </w:r>
-    </w:p>
-    <w:p>
-      <w:r>
-        <w:t>[6]  R. E. Bellman, Dynamic Programming. Princeton, NJ: Princeton University Press, 1957. [Foundational DP reference.]</w:t>
-      </w:r>
-    </w:p>
-    <w:p>
-      <w:r>
-        <w:t xml:space="preserve">[7]  F. P. </w:t>
-      </w:r>
-      <w:proofErr w:type="spellStart"/>
-      <w:r>
-        <w:t>Preparata</w:t>
-      </w:r>
-      <w:proofErr w:type="spellEnd"/>
-      <w:r>
-        <w:t xml:space="preserve"> and M. I. </w:t>
-      </w:r>
-      <w:proofErr w:type="spellStart"/>
-      <w:r>
-        <w:t>Shamos</w:t>
-      </w:r>
-      <w:proofErr w:type="spellEnd"/>
-      <w:r>
-        <w:t>, Computational Geometry: An Introduction. New York: Springer, 1985. [Geometric algorithms and point-on-segment tests.]</w:t>
-      </w:r>
-    </w:p>
-    <w:p>
-      <w:r>
-        <w:t xml:space="preserve">[8]  M. de Berg, O. Cheong, M. van </w:t>
-      </w:r>
-      <w:proofErr w:type="spellStart"/>
-      <w:r>
-        <w:t>Kreveld</w:t>
-      </w:r>
-      <w:proofErr w:type="spellEnd"/>
-      <w:r>
-        <w:t>, and M. Overmars, Computational Geometry: Algorithms and Applications, 3rd ed. Berlin: Springer, 2008.</w:t>
-      </w:r>
-    </w:p>
-    <w:p>
-      <w:r>
-        <w:t>[9]  R. Sedgewick and K. Wayne, Algorithms, 4th ed. Boston: Addison-Wesley, 2011. [Graph search algorithms and backtracking.]</w:t>
-      </w:r>
-    </w:p>
-    <w:p>
-      <w:r>
-        <w:t xml:space="preserve">[10] B. </w:t>
-      </w:r>
-      <w:proofErr w:type="spellStart"/>
-      <w:r>
-        <w:t>Stroustrup</w:t>
-      </w:r>
-      <w:proofErr w:type="spellEnd"/>
-      <w:r>
-        <w:t>, The C++ Programming Language, 4th ed. Boston: Addison-Wesley, 2013. [C++17 implementation reference.]</w:t>
-      </w:r>
-    </w:p>
-    <w:p>
-      <w:r>
-        <w:t xml:space="preserve">[11] D. Applegate, R. Bixby, V. </w:t>
-      </w:r>
-      <w:proofErr w:type="spellStart"/>
-      <w:r>
-        <w:t>Chvátal</w:t>
-      </w:r>
-      <w:proofErr w:type="spellEnd"/>
-      <w:r>
-        <w:t xml:space="preserve">, and W. Cook, The Traveling Salesman Problem: A Computational Study. Princeton, NJ: Princeton University Press, 2006. [Combinatorial </w:t>
-      </w:r>
-      <w:proofErr w:type="spellStart"/>
-      <w:r>
-        <w:t>optimisation</w:t>
-      </w:r>
-      <w:proofErr w:type="spellEnd"/>
-      <w:r>
-        <w:t xml:space="preserve"> background.]</w:t>
-      </w:r>
-    </w:p>
-    <w:p/>
-    <w:p/>
-    <w:p/>
-    <w:p/>
+    </w:p>
     <w:p/>
     <w:sectPr>
       <w:pgSz w:w="11906" w:h="16838"/>
@@ -1130,6 +1126,119 @@
     </w:lvl>
   </w:abstractNum>
   <w:abstractNum w:abstractNumId="1" w15:restartNumberingAfterBreak="0">
+    <w:nsid w:val="1F5D7748"/>
+    <w:multiLevelType w:val="hybridMultilevel"/>
+    <w:tmpl w:val="AE509F44"/>
+    <w:lvl w:ilvl="0" w:tplc="04090001">
+      <w:start w:val="1"/>
+      <w:numFmt w:val="bullet"/>
+      <w:lvlText w:val=""/>
+      <w:lvlJc w:val="left"/>
+      <w:pPr>
+        <w:ind w:left="360" w:hanging="360"/>
+      </w:pPr>
+      <w:rPr>
+        <w:rFonts w:ascii="Symbol" w:hAnsi="Symbol" w:hint="default"/>
+      </w:rPr>
+    </w:lvl>
+    <w:lvl w:ilvl="1" w:tplc="04090003" w:tentative="1">
+      <w:start w:val="1"/>
+      <w:numFmt w:val="bullet"/>
+      <w:lvlText w:val="o"/>
+      <w:lvlJc w:val="left"/>
+      <w:pPr>
+        <w:ind w:left="1080" w:hanging="360"/>
+      </w:pPr>
+      <w:rPr>
+        <w:rFonts w:ascii="Courier New" w:hAnsi="Courier New" w:cs="Courier New" w:hint="default"/>
+      </w:rPr>
+    </w:lvl>
+    <w:lvl w:ilvl="2" w:tplc="04090005" w:tentative="1">
+      <w:start w:val="1"/>
+      <w:numFmt w:val="bullet"/>
+      <w:lvlText w:val=""/>
+      <w:lvlJc w:val="left"/>
+      <w:pPr>
+        <w:ind w:left="1800" w:hanging="360"/>
+      </w:pPr>
+      <w:rPr>
+        <w:rFonts w:ascii="Wingdings" w:hAnsi="Wingdings" w:hint="default"/>
+      </w:rPr>
+    </w:lvl>
+    <w:lvl w:ilvl="3" w:tplc="04090001" w:tentative="1">
+      <w:start w:val="1"/>
+      <w:numFmt w:val="bullet"/>
+      <w:lvlText w:val=""/>
+      <w:lvlJc w:val="left"/>
+      <w:pPr>
+        <w:ind w:left="2520" w:hanging="360"/>
+      </w:pPr>
+      <w:rPr>
+        <w:rFonts w:ascii="Symbol" w:hAnsi="Symbol" w:hint="default"/>
+      </w:rPr>
+    </w:lvl>
+    <w:lvl w:ilvl="4" w:tplc="04090003" w:tentative="1">
+      <w:start w:val="1"/>
+      <w:numFmt w:val="bullet"/>
+      <w:lvlText w:val="o"/>
+      <w:lvlJc w:val="left"/>
+      <w:pPr>
+        <w:ind w:left="3240" w:hanging="360"/>
+      </w:pPr>
+      <w:rPr>
+        <w:rFonts w:ascii="Courier New" w:hAnsi="Courier New" w:cs="Courier New" w:hint="default"/>
+      </w:rPr>
+    </w:lvl>
+    <w:lvl w:ilvl="5" w:tplc="04090005" w:tentative="1">
+      <w:start w:val="1"/>
+      <w:numFmt w:val="bullet"/>
+      <w:lvlText w:val=""/>
+      <w:lvlJc w:val="left"/>
+      <w:pPr>
+        <w:ind w:left="3960" w:hanging="360"/>
+      </w:pPr>
+      <w:rPr>
+        <w:rFonts w:ascii="Wingdings" w:hAnsi="Wingdings" w:hint="default"/>
+      </w:rPr>
+    </w:lvl>
+    <w:lvl w:ilvl="6" w:tplc="04090001" w:tentative="1">
+      <w:start w:val="1"/>
+      <w:numFmt w:val="bullet"/>
+      <w:lvlText w:val=""/>
+      <w:lvlJc w:val="left"/>
+      <w:pPr>
+        <w:ind w:left="4680" w:hanging="360"/>
+      </w:pPr>
+      <w:rPr>
+        <w:rFonts w:ascii="Symbol" w:hAnsi="Symbol" w:hint="default"/>
+      </w:rPr>
+    </w:lvl>
+    <w:lvl w:ilvl="7" w:tplc="04090003" w:tentative="1">
+      <w:start w:val="1"/>
+      <w:numFmt w:val="bullet"/>
+      <w:lvlText w:val="o"/>
+      <w:lvlJc w:val="left"/>
+      <w:pPr>
+        <w:ind w:left="5400" w:hanging="360"/>
+      </w:pPr>
+      <w:rPr>
+        <w:rFonts w:ascii="Courier New" w:hAnsi="Courier New" w:cs="Courier New" w:hint="default"/>
+      </w:rPr>
+    </w:lvl>
+    <w:lvl w:ilvl="8" w:tplc="04090005" w:tentative="1">
+      <w:start w:val="1"/>
+      <w:numFmt w:val="bullet"/>
+      <w:lvlText w:val=""/>
+      <w:lvlJc w:val="left"/>
+      <w:pPr>
+        <w:ind w:left="6120" w:hanging="360"/>
+      </w:pPr>
+      <w:rPr>
+        <w:rFonts w:ascii="Wingdings" w:hAnsi="Wingdings" w:hint="default"/>
+      </w:rPr>
+    </w:lvl>
+  </w:abstractNum>
+  <w:abstractNum w:abstractNumId="2" w15:restartNumberingAfterBreak="0">
     <w:nsid w:val="306A0712"/>
     <w:multiLevelType w:val="hybridMultilevel"/>
     <w:tmpl w:val="C840DE52"/>
@@ -1183,7 +1292,7 @@
       <w:lvlJc w:val="left"/>
     </w:lvl>
   </w:abstractNum>
-  <w:abstractNum w:abstractNumId="2" w15:restartNumberingAfterBreak="0">
+  <w:abstractNum w:abstractNumId="3" w15:restartNumberingAfterBreak="0">
     <w:nsid w:val="55A90CF4"/>
     <w:multiLevelType w:val="hybridMultilevel"/>
     <w:tmpl w:val="52F62F94"/>
@@ -1269,7 +1378,7 @@
       </w:pPr>
     </w:lvl>
   </w:abstractNum>
-  <w:abstractNum w:abstractNumId="3" w15:restartNumberingAfterBreak="0">
+  <w:abstractNum w:abstractNumId="4" w15:restartNumberingAfterBreak="0">
     <w:nsid w:val="5CF31ED2"/>
     <w:multiLevelType w:val="hybridMultilevel"/>
     <w:tmpl w:val="4DEA95F4"/>
@@ -1382,7 +1491,120 @@
       </w:rPr>
     </w:lvl>
   </w:abstractNum>
-  <w:abstractNum w:abstractNumId="4" w15:restartNumberingAfterBreak="0">
+  <w:abstractNum w:abstractNumId="5" w15:restartNumberingAfterBreak="0">
+    <w:nsid w:val="62A06320"/>
+    <w:multiLevelType w:val="hybridMultilevel"/>
+    <w:tmpl w:val="34CA723A"/>
+    <w:lvl w:ilvl="0" w:tplc="04090001">
+      <w:start w:val="1"/>
+      <w:numFmt w:val="bullet"/>
+      <w:lvlText w:val=""/>
+      <w:lvlJc w:val="left"/>
+      <w:pPr>
+        <w:ind w:left="720" w:hanging="360"/>
+      </w:pPr>
+      <w:rPr>
+        <w:rFonts w:ascii="Symbol" w:hAnsi="Symbol" w:hint="default"/>
+      </w:rPr>
+    </w:lvl>
+    <w:lvl w:ilvl="1" w:tplc="04090003" w:tentative="1">
+      <w:start w:val="1"/>
+      <w:numFmt w:val="bullet"/>
+      <w:lvlText w:val="o"/>
+      <w:lvlJc w:val="left"/>
+      <w:pPr>
+        <w:ind w:left="1440" w:hanging="360"/>
+      </w:pPr>
+      <w:rPr>
+        <w:rFonts w:ascii="Courier New" w:hAnsi="Courier New" w:cs="Courier New" w:hint="default"/>
+      </w:rPr>
+    </w:lvl>
+    <w:lvl w:ilvl="2" w:tplc="04090005" w:tentative="1">
+      <w:start w:val="1"/>
+      <w:numFmt w:val="bullet"/>
+      <w:lvlText w:val=""/>
+      <w:lvlJc w:val="left"/>
+      <w:pPr>
+        <w:ind w:left="2160" w:hanging="360"/>
+      </w:pPr>
+      <w:rPr>
+        <w:rFonts w:ascii="Wingdings" w:hAnsi="Wingdings" w:hint="default"/>
+      </w:rPr>
+    </w:lvl>
+    <w:lvl w:ilvl="3" w:tplc="04090001" w:tentative="1">
+      <w:start w:val="1"/>
+      <w:numFmt w:val="bullet"/>
+      <w:lvlText w:val=""/>
+      <w:lvlJc w:val="left"/>
+      <w:pPr>
+        <w:ind w:left="2880" w:hanging="360"/>
+      </w:pPr>
+      <w:rPr>
+        <w:rFonts w:ascii="Symbol" w:hAnsi="Symbol" w:hint="default"/>
+      </w:rPr>
+    </w:lvl>
+    <w:lvl w:ilvl="4" w:tplc="04090003" w:tentative="1">
+      <w:start w:val="1"/>
+      <w:numFmt w:val="bullet"/>
+      <w:lvlText w:val="o"/>
+      <w:lvlJc w:val="left"/>
+      <w:pPr>
+        <w:ind w:left="3600" w:hanging="360"/>
+      </w:pPr>
+      <w:rPr>
+        <w:rFonts w:ascii="Courier New" w:hAnsi="Courier New" w:cs="Courier New" w:hint="default"/>
+      </w:rPr>
+    </w:lvl>
+    <w:lvl w:ilvl="5" w:tplc="04090005" w:tentative="1">
+      <w:start w:val="1"/>
+      <w:numFmt w:val="bullet"/>
+      <w:lvlText w:val=""/>
+      <w:lvlJc w:val="left"/>
+      <w:pPr>
+        <w:ind w:left="4320" w:hanging="360"/>
+      </w:pPr>
+      <w:rPr>
+        <w:rFonts w:ascii="Wingdings" w:hAnsi="Wingdings" w:hint="default"/>
+      </w:rPr>
+    </w:lvl>
+    <w:lvl w:ilvl="6" w:tplc="04090001" w:tentative="1">
+      <w:start w:val="1"/>
+      <w:numFmt w:val="bullet"/>
+      <w:lvlText w:val=""/>
+      <w:lvlJc w:val="left"/>
+      <w:pPr>
+        <w:ind w:left="5040" w:hanging="360"/>
+      </w:pPr>
+      <w:rPr>
+        <w:rFonts w:ascii="Symbol" w:hAnsi="Symbol" w:hint="default"/>
+      </w:rPr>
+    </w:lvl>
+    <w:lvl w:ilvl="7" w:tplc="04090003" w:tentative="1">
+      <w:start w:val="1"/>
+      <w:numFmt w:val="bullet"/>
+      <w:lvlText w:val="o"/>
+      <w:lvlJc w:val="left"/>
+      <w:pPr>
+        <w:ind w:left="5760" w:hanging="360"/>
+      </w:pPr>
+      <w:rPr>
+        <w:rFonts w:ascii="Courier New" w:hAnsi="Courier New" w:cs="Courier New" w:hint="default"/>
+      </w:rPr>
+    </w:lvl>
+    <w:lvl w:ilvl="8" w:tplc="04090005" w:tentative="1">
+      <w:start w:val="1"/>
+      <w:numFmt w:val="bullet"/>
+      <w:lvlText w:val=""/>
+      <w:lvlJc w:val="left"/>
+      <w:pPr>
+        <w:ind w:left="6480" w:hanging="360"/>
+      </w:pPr>
+      <w:rPr>
+        <w:rFonts w:ascii="Wingdings" w:hAnsi="Wingdings" w:hint="default"/>
+      </w:rPr>
+    </w:lvl>
+  </w:abstractNum>
+  <w:abstractNum w:abstractNumId="6" w15:restartNumberingAfterBreak="0">
     <w:nsid w:val="68670167"/>
     <w:multiLevelType w:val="hybridMultilevel"/>
     <w:tmpl w:val="173CADCA"/>
@@ -1468,7 +1690,120 @@
       </w:pPr>
     </w:lvl>
   </w:abstractNum>
-  <w:abstractNum w:abstractNumId="5" w15:restartNumberingAfterBreak="0">
+  <w:abstractNum w:abstractNumId="7" w15:restartNumberingAfterBreak="0">
+    <w:nsid w:val="73B5386A"/>
+    <w:multiLevelType w:val="hybridMultilevel"/>
+    <w:tmpl w:val="0E5E992A"/>
+    <w:lvl w:ilvl="0" w:tplc="04090001">
+      <w:start w:val="1"/>
+      <w:numFmt w:val="bullet"/>
+      <w:lvlText w:val=""/>
+      <w:lvlJc w:val="left"/>
+      <w:pPr>
+        <w:ind w:left="360" w:hanging="360"/>
+      </w:pPr>
+      <w:rPr>
+        <w:rFonts w:ascii="Symbol" w:hAnsi="Symbol" w:hint="default"/>
+      </w:rPr>
+    </w:lvl>
+    <w:lvl w:ilvl="1" w:tplc="04090003" w:tentative="1">
+      <w:start w:val="1"/>
+      <w:numFmt w:val="bullet"/>
+      <w:lvlText w:val="o"/>
+      <w:lvlJc w:val="left"/>
+      <w:pPr>
+        <w:ind w:left="1080" w:hanging="360"/>
+      </w:pPr>
+      <w:rPr>
+        <w:rFonts w:ascii="Courier New" w:hAnsi="Courier New" w:cs="Courier New" w:hint="default"/>
+      </w:rPr>
+    </w:lvl>
+    <w:lvl w:ilvl="2" w:tplc="04090005" w:tentative="1">
+      <w:start w:val="1"/>
+      <w:numFmt w:val="bullet"/>
+      <w:lvlText w:val=""/>
+      <w:lvlJc w:val="left"/>
+      <w:pPr>
+        <w:ind w:left="1800" w:hanging="360"/>
+      </w:pPr>
+      <w:rPr>
+        <w:rFonts w:ascii="Wingdings" w:hAnsi="Wingdings" w:hint="default"/>
+      </w:rPr>
+    </w:lvl>
+    <w:lvl w:ilvl="3" w:tplc="04090001" w:tentative="1">
+      <w:start w:val="1"/>
+      <w:numFmt w:val="bullet"/>
+      <w:lvlText w:val=""/>
+      <w:lvlJc w:val="left"/>
+      <w:pPr>
+        <w:ind w:left="2520" w:hanging="360"/>
+      </w:pPr>
+      <w:rPr>
+        <w:rFonts w:ascii="Symbol" w:hAnsi="Symbol" w:hint="default"/>
+      </w:rPr>
+    </w:lvl>
+    <w:lvl w:ilvl="4" w:tplc="04090003" w:tentative="1">
+      <w:start w:val="1"/>
+      <w:numFmt w:val="bullet"/>
+      <w:lvlText w:val="o"/>
+      <w:lvlJc w:val="left"/>
+      <w:pPr>
+        <w:ind w:left="3240" w:hanging="360"/>
+      </w:pPr>
+      <w:rPr>
+        <w:rFonts w:ascii="Courier New" w:hAnsi="Courier New" w:cs="Courier New" w:hint="default"/>
+      </w:rPr>
+    </w:lvl>
+    <w:lvl w:ilvl="5" w:tplc="04090005" w:tentative="1">
+      <w:start w:val="1"/>
+      <w:numFmt w:val="bullet"/>
+      <w:lvlText w:val=""/>
+      <w:lvlJc w:val="left"/>
+      <w:pPr>
+        <w:ind w:left="3960" w:hanging="360"/>
+      </w:pPr>
+      <w:rPr>
+        <w:rFonts w:ascii="Wingdings" w:hAnsi="Wingdings" w:hint="default"/>
+      </w:rPr>
+    </w:lvl>
+    <w:lvl w:ilvl="6" w:tplc="04090001" w:tentative="1">
+      <w:start w:val="1"/>
+      <w:numFmt w:val="bullet"/>
+      <w:lvlText w:val=""/>
+      <w:lvlJc w:val="left"/>
+      <w:pPr>
+        <w:ind w:left="4680" w:hanging="360"/>
+      </w:pPr>
+      <w:rPr>
+        <w:rFonts w:ascii="Symbol" w:hAnsi="Symbol" w:hint="default"/>
+      </w:rPr>
+    </w:lvl>
+    <w:lvl w:ilvl="7" w:tplc="04090003" w:tentative="1">
+      <w:start w:val="1"/>
+      <w:numFmt w:val="bullet"/>
+      <w:lvlText w:val="o"/>
+      <w:lvlJc w:val="left"/>
+      <w:pPr>
+        <w:ind w:left="5400" w:hanging="360"/>
+      </w:pPr>
+      <w:rPr>
+        <w:rFonts w:ascii="Courier New" w:hAnsi="Courier New" w:cs="Courier New" w:hint="default"/>
+      </w:rPr>
+    </w:lvl>
+    <w:lvl w:ilvl="8" w:tplc="04090005" w:tentative="1">
+      <w:start w:val="1"/>
+      <w:numFmt w:val="bullet"/>
+      <w:lvlText w:val=""/>
+      <w:lvlJc w:val="left"/>
+      <w:pPr>
+        <w:ind w:left="6120" w:hanging="360"/>
+      </w:pPr>
+      <w:rPr>
+        <w:rFonts w:ascii="Wingdings" w:hAnsi="Wingdings" w:hint="default"/>
+      </w:rPr>
+    </w:lvl>
+  </w:abstractNum>
+  <w:abstractNum w:abstractNumId="8" w15:restartNumberingAfterBreak="0">
     <w:nsid w:val="7CAE7C0B"/>
     <w:multiLevelType w:val="hybridMultilevel"/>
     <w:tmpl w:val="75862B0C"/>
@@ -1582,19 +1917,19 @@
     </w:lvl>
   </w:abstractNum>
   <w:num w:numId="1" w16cid:durableId="1336766346">
+    <w:abstractNumId w:val="4"/>
+  </w:num>
+  <w:num w:numId="2" w16cid:durableId="499586978">
+    <w:abstractNumId w:val="6"/>
+  </w:num>
+  <w:num w:numId="3" w16cid:durableId="901713572">
     <w:abstractNumId w:val="3"/>
   </w:num>
-  <w:num w:numId="2" w16cid:durableId="499586978">
-    <w:abstractNumId w:val="4"/>
-  </w:num>
-  <w:num w:numId="3" w16cid:durableId="901713572">
-    <w:abstractNumId w:val="2"/>
-  </w:num>
   <w:num w:numId="4" w16cid:durableId="913706840">
-    <w:abstractNumId w:val="5"/>
+    <w:abstractNumId w:val="8"/>
   </w:num>
   <w:num w:numId="5" w16cid:durableId="489249172">
-    <w:abstractNumId w:val="1"/>
+    <w:abstractNumId w:val="2"/>
     <w:lvlOverride w:ilvl="0">
       <w:startOverride w:val="1"/>
     </w:lvlOverride>
@@ -1612,6 +1947,15 @@
     <w:lvlOverride w:ilvl="6"/>
     <w:lvlOverride w:ilvl="7"/>
     <w:lvlOverride w:ilvl="8"/>
+  </w:num>
+  <w:num w:numId="7" w16cid:durableId="489642075">
+    <w:abstractNumId w:val="5"/>
+  </w:num>
+  <w:num w:numId="8" w16cid:durableId="577979623">
+    <w:abstractNumId w:val="1"/>
+  </w:num>
+  <w:num w:numId="9" w16cid:durableId="1721783737">
+    <w:abstractNumId w:val="7"/>
   </w:num>
 </w:numbering>
 </file>
@@ -2070,7 +2414,6 @@
   <w:style w:type="character" w:default="1" w:styleId="DefaultParagraphFont">
     <w:name w:val="Default Paragraph Font"/>
     <w:uiPriority w:val="1"/>
-    <w:semiHidden/>
     <w:unhideWhenUsed/>
   </w:style>
   <w:style w:type="table" w:default="1" w:styleId="TableNormal">
@@ -2176,6 +2519,18 @@
     <w:rPr>
       <w:color w:val="0563C1"/>
       <w:u w:val="single"/>
+    </w:rPr>
+  </w:style>
+  <w:style w:type="character" w:styleId="UnresolvedMention">
+    <w:name w:val="Unresolved Mention"/>
+    <w:basedOn w:val="DefaultParagraphFont"/>
+    <w:uiPriority w:val="99"/>
+    <w:semiHidden/>
+    <w:unhideWhenUsed/>
+    <w:rsid w:val="006D3E49"/>
+    <w:rPr>
+      <w:color w:val="605E5C"/>
+      <w:shd w:val="clear" w:color="auto" w:fill="E1DFDD"/>
     </w:rPr>
   </w:style>
 </w:styles>

</xml_diff>